<commit_message>
Informe EP3: limpieza de texto duplicado y formato
</commit_message>
<xml_diff>
--- a/docs/Evaluaciones/EV2/EV2 Contexto/Entregables/EP3-Informe-Cuidarte-Mas-avance.docx
+++ b/docs/Evaluaciones/EV2/EV2 Contexto/Entregables/EP3-Informe-Cuidarte-Mas-avance.docx
@@ -587,11 +587,15 @@
         </w:tabs>
         <w:spacing w:after="0" w:line="240" w:lineRule="auto"/>
         <w:ind w:left="340"/>
+        <w:rPr>
+          <w:lang w:val="es-CL"/>
+        </w:rPr>
       </w:pPr>
       <w:r>
         <w:rPr>
           <w:sz w:val="19"/>
           <w:szCs w:val="19"/>
+          <w:lang w:val="es-CL"/>
         </w:rPr>
         <w:t>1.2 Propósito del plan y de este informe</w:t>
       </w:r>
@@ -599,6 +603,7 @@
         <w:rPr>
           <w:sz w:val="19"/>
           <w:szCs w:val="19"/>
+          <w:lang w:val="es-CL"/>
         </w:rPr>
         <w:tab/>
         <w:t>4</w:t>
@@ -611,11 +616,15 @@
         </w:tabs>
         <w:spacing w:after="0" w:line="240" w:lineRule="auto"/>
         <w:ind w:left="340"/>
+        <w:rPr>
+          <w:lang w:val="es-CL"/>
+        </w:rPr>
       </w:pPr>
       <w:r>
         <w:rPr>
           <w:sz w:val="19"/>
           <w:szCs w:val="19"/>
+          <w:lang w:val="es-CL"/>
         </w:rPr>
         <w:t>1.3 Objetivos</w:t>
       </w:r>
@@ -623,6 +632,7 @@
         <w:rPr>
           <w:sz w:val="19"/>
           <w:szCs w:val="19"/>
+          <w:lang w:val="es-CL"/>
         </w:rPr>
         <w:tab/>
         <w:t>4</w:t>
@@ -635,11 +645,15 @@
         </w:tabs>
         <w:spacing w:after="0" w:line="240" w:lineRule="auto"/>
         <w:ind w:left="340"/>
+        <w:rPr>
+          <w:lang w:val="es-CL"/>
+        </w:rPr>
       </w:pPr>
       <w:r>
         <w:rPr>
           <w:sz w:val="19"/>
           <w:szCs w:val="19"/>
+          <w:lang w:val="es-CL"/>
         </w:rPr>
         <w:t>1.4 Alcance</w:t>
       </w:r>
@@ -647,6 +661,7 @@
         <w:rPr>
           <w:sz w:val="19"/>
           <w:szCs w:val="19"/>
+          <w:lang w:val="es-CL"/>
         </w:rPr>
         <w:tab/>
         <w:t>5</w:t>
@@ -659,11 +674,15 @@
         </w:tabs>
         <w:spacing w:after="0" w:line="240" w:lineRule="auto"/>
         <w:ind w:left="340"/>
+        <w:rPr>
+          <w:lang w:val="es-CL"/>
+        </w:rPr>
       </w:pPr>
       <w:r>
         <w:rPr>
           <w:sz w:val="19"/>
           <w:szCs w:val="19"/>
+          <w:lang w:val="es-CL"/>
         </w:rPr>
         <w:t>1.5 Estructura del informe</w:t>
       </w:r>
@@ -671,6 +690,7 @@
         <w:rPr>
           <w:sz w:val="19"/>
           <w:szCs w:val="19"/>
+          <w:lang w:val="es-CL"/>
         </w:rPr>
         <w:tab/>
         <w:t>5</w:t>
@@ -682,12 +702,16 @@
           <w:tab w:val="right" w:leader="dot" w:pos="9071"/>
         </w:tabs>
         <w:spacing w:after="0" w:line="240" w:lineRule="auto"/>
+        <w:rPr>
+          <w:lang w:val="es-CL"/>
+        </w:rPr>
       </w:pPr>
       <w:r>
         <w:rPr>
           <w:b/>
           <w:sz w:val="19"/>
           <w:szCs w:val="19"/>
+          <w:lang w:val="es-CL"/>
         </w:rPr>
         <w:t>2. Criterios de calidad</w:t>
       </w:r>
@@ -696,6 +720,7 @@
           <w:b/>
           <w:sz w:val="19"/>
           <w:szCs w:val="19"/>
+          <w:lang w:val="es-CL"/>
         </w:rPr>
         <w:tab/>
         <w:t>5</w:t>
@@ -708,11 +733,15 @@
         </w:tabs>
         <w:spacing w:after="0" w:line="240" w:lineRule="auto"/>
         <w:ind w:left="340"/>
+        <w:rPr>
+          <w:lang w:val="es-CL"/>
+        </w:rPr>
       </w:pPr>
       <w:r>
         <w:rPr>
           <w:sz w:val="19"/>
           <w:szCs w:val="19"/>
+          <w:lang w:val="es-CL"/>
         </w:rPr>
         <w:t>2.1 Calidad del producto</w:t>
       </w:r>
@@ -720,6 +749,7 @@
         <w:rPr>
           <w:sz w:val="19"/>
           <w:szCs w:val="19"/>
+          <w:lang w:val="es-CL"/>
         </w:rPr>
         <w:tab/>
         <w:t>6</w:t>
@@ -732,11 +762,15 @@
         </w:tabs>
         <w:spacing w:after="0" w:line="240" w:lineRule="auto"/>
         <w:ind w:left="340"/>
+        <w:rPr>
+          <w:lang w:val="es-CL"/>
+        </w:rPr>
       </w:pPr>
       <w:r>
         <w:rPr>
           <w:sz w:val="19"/>
           <w:szCs w:val="19"/>
+          <w:lang w:val="es-CL"/>
         </w:rPr>
         <w:t>2.2 Seguridad</w:t>
       </w:r>
@@ -744,6 +778,7 @@
         <w:rPr>
           <w:sz w:val="19"/>
           <w:szCs w:val="19"/>
+          <w:lang w:val="es-CL"/>
         </w:rPr>
         <w:tab/>
         <w:t>6</w:t>
@@ -756,11 +791,15 @@
         </w:tabs>
         <w:spacing w:after="0" w:line="240" w:lineRule="auto"/>
         <w:ind w:left="340"/>
+        <w:rPr>
+          <w:lang w:val="es-CL"/>
+        </w:rPr>
       </w:pPr>
       <w:r>
         <w:rPr>
           <w:sz w:val="19"/>
           <w:szCs w:val="19"/>
+          <w:lang w:val="es-CL"/>
         </w:rPr>
         <w:t>2.3 Cumplimiento normativo</w:t>
       </w:r>
@@ -768,6 +807,7 @@
         <w:rPr>
           <w:sz w:val="19"/>
           <w:szCs w:val="19"/>
+          <w:lang w:val="es-CL"/>
         </w:rPr>
         <w:tab/>
         <w:t>7</w:t>
@@ -779,12 +819,16 @@
           <w:tab w:val="right" w:leader="dot" w:pos="9071"/>
         </w:tabs>
         <w:spacing w:after="0" w:line="240" w:lineRule="auto"/>
+        <w:rPr>
+          <w:lang w:val="es-CL"/>
+        </w:rPr>
       </w:pPr>
       <w:r>
         <w:rPr>
           <w:b/>
           <w:sz w:val="19"/>
           <w:szCs w:val="19"/>
+          <w:lang w:val="es-CL"/>
         </w:rPr>
         <w:t>3. Plan de pruebas</w:t>
       </w:r>
@@ -793,6 +837,7 @@
           <w:b/>
           <w:sz w:val="19"/>
           <w:szCs w:val="19"/>
+          <w:lang w:val="es-CL"/>
         </w:rPr>
         <w:tab/>
         <w:t>7</w:t>
@@ -805,11 +850,15 @@
         </w:tabs>
         <w:spacing w:after="0" w:line="240" w:lineRule="auto"/>
         <w:ind w:left="340"/>
+        <w:rPr>
+          <w:lang w:val="es-CL"/>
+        </w:rPr>
       </w:pPr>
       <w:r>
         <w:rPr>
           <w:sz w:val="19"/>
           <w:szCs w:val="19"/>
+          <w:lang w:val="es-CL"/>
         </w:rPr>
         <w:t>3.1 Estrategia de pruebas</w:t>
       </w:r>
@@ -817,6 +866,7 @@
         <w:rPr>
           <w:sz w:val="19"/>
           <w:szCs w:val="19"/>
+          <w:lang w:val="es-CL"/>
         </w:rPr>
         <w:tab/>
         <w:t>7</w:t>
@@ -829,11 +879,15 @@
         </w:tabs>
         <w:spacing w:after="0" w:line="240" w:lineRule="auto"/>
         <w:ind w:left="340"/>
+        <w:rPr>
+          <w:lang w:val="es-CL"/>
+        </w:rPr>
       </w:pPr>
       <w:r>
         <w:rPr>
           <w:sz w:val="19"/>
           <w:szCs w:val="19"/>
+          <w:lang w:val="es-CL"/>
         </w:rPr>
         <w:t>3.2 Tipos de prueba</w:t>
       </w:r>
@@ -841,6 +895,7 @@
         <w:rPr>
           <w:sz w:val="19"/>
           <w:szCs w:val="19"/>
+          <w:lang w:val="es-CL"/>
         </w:rPr>
         <w:tab/>
         <w:t>9</w:t>
@@ -853,11 +908,15 @@
         </w:tabs>
         <w:spacing w:after="0" w:line="240" w:lineRule="auto"/>
         <w:ind w:left="340"/>
+        <w:rPr>
+          <w:lang w:val="es-CL"/>
+        </w:rPr>
       </w:pPr>
       <w:r>
         <w:rPr>
           <w:sz w:val="19"/>
           <w:szCs w:val="19"/>
+          <w:lang w:val="es-CL"/>
         </w:rPr>
         <w:t>3.3 Criterios de aceptación</w:t>
       </w:r>
@@ -865,6 +924,7 @@
         <w:rPr>
           <w:sz w:val="19"/>
           <w:szCs w:val="19"/>
+          <w:lang w:val="es-CL"/>
         </w:rPr>
         <w:tab/>
         <w:t>10</w:t>
@@ -877,11 +937,15 @@
         </w:tabs>
         <w:spacing w:after="0" w:line="240" w:lineRule="auto"/>
         <w:ind w:left="340"/>
+        <w:rPr>
+          <w:lang w:val="es-CL"/>
+        </w:rPr>
       </w:pPr>
       <w:r>
         <w:rPr>
           <w:sz w:val="19"/>
           <w:szCs w:val="19"/>
+          <w:lang w:val="es-CL"/>
         </w:rPr>
         <w:t>3.4 Herramientas utilizadas</w:t>
       </w:r>
@@ -889,6 +953,7 @@
         <w:rPr>
           <w:sz w:val="19"/>
           <w:szCs w:val="19"/>
+          <w:lang w:val="es-CL"/>
         </w:rPr>
         <w:tab/>
         <w:t>11</w:t>
@@ -900,12 +965,16 @@
           <w:tab w:val="right" w:leader="dot" w:pos="9071"/>
         </w:tabs>
         <w:spacing w:after="0" w:line="240" w:lineRule="auto"/>
+        <w:rPr>
+          <w:lang w:val="es-CL"/>
+        </w:rPr>
       </w:pPr>
       <w:r>
         <w:rPr>
           <w:b/>
           <w:sz w:val="19"/>
           <w:szCs w:val="19"/>
+          <w:lang w:val="es-CL"/>
         </w:rPr>
         <w:t>4. Diseño de casos de prueba</w:t>
       </w:r>
@@ -914,6 +983,7 @@
           <w:b/>
           <w:sz w:val="19"/>
           <w:szCs w:val="19"/>
+          <w:lang w:val="es-CL"/>
         </w:rPr>
         <w:tab/>
         <w:t>14</w:t>
@@ -926,11 +996,15 @@
         </w:tabs>
         <w:spacing w:after="0" w:line="240" w:lineRule="auto"/>
         <w:ind w:left="340"/>
+        <w:rPr>
+          <w:lang w:val="es-CL"/>
+        </w:rPr>
       </w:pPr>
       <w:r>
         <w:rPr>
           <w:sz w:val="19"/>
           <w:szCs w:val="19"/>
+          <w:lang w:val="es-CL"/>
         </w:rPr>
         <w:t>4.1 Matriz de trazabilidad</w:t>
       </w:r>
@@ -938,6 +1012,7 @@
         <w:rPr>
           <w:sz w:val="19"/>
           <w:szCs w:val="19"/>
+          <w:lang w:val="es-CL"/>
         </w:rPr>
         <w:tab/>
         <w:t>14</w:t>
@@ -950,11 +1025,15 @@
         </w:tabs>
         <w:spacing w:after="0" w:line="240" w:lineRule="auto"/>
         <w:ind w:left="340"/>
+        <w:rPr>
+          <w:lang w:val="es-CL"/>
+        </w:rPr>
       </w:pPr>
       <w:r>
         <w:rPr>
           <w:sz w:val="19"/>
           <w:szCs w:val="19"/>
+          <w:lang w:val="es-CL"/>
         </w:rPr>
         <w:t>4.2 Catálogo de casos</w:t>
       </w:r>
@@ -962,6 +1041,7 @@
         <w:rPr>
           <w:sz w:val="19"/>
           <w:szCs w:val="19"/>
+          <w:lang w:val="es-CL"/>
         </w:rPr>
         <w:tab/>
         <w:t>16</w:t>
@@ -974,11 +1054,15 @@
         </w:tabs>
         <w:spacing w:after="0" w:line="240" w:lineRule="auto"/>
         <w:ind w:left="340"/>
+        <w:rPr>
+          <w:lang w:val="es-CL"/>
+        </w:rPr>
       </w:pPr>
       <w:r>
         <w:rPr>
           <w:sz w:val="19"/>
           <w:szCs w:val="19"/>
+          <w:lang w:val="es-CL"/>
         </w:rPr>
         <w:t>4.3 Casos detallados</w:t>
       </w:r>
@@ -986,6 +1070,7 @@
         <w:rPr>
           <w:sz w:val="19"/>
           <w:szCs w:val="19"/>
+          <w:lang w:val="es-CL"/>
         </w:rPr>
         <w:tab/>
         <w:t>17</w:t>
@@ -997,12 +1082,16 @@
           <w:tab w:val="right" w:leader="dot" w:pos="9071"/>
         </w:tabs>
         <w:spacing w:after="0" w:line="240" w:lineRule="auto"/>
+        <w:rPr>
+          <w:lang w:val="es-CL"/>
+        </w:rPr>
       </w:pPr>
       <w:r>
         <w:rPr>
           <w:b/>
           <w:sz w:val="19"/>
           <w:szCs w:val="19"/>
+          <w:lang w:val="es-CL"/>
         </w:rPr>
         <w:t>5. Ejecución de pruebas</w:t>
       </w:r>
@@ -1011,6 +1100,7 @@
           <w:b/>
           <w:sz w:val="19"/>
           <w:szCs w:val="19"/>
+          <w:lang w:val="es-CL"/>
         </w:rPr>
         <w:tab/>
         <w:t>24</w:t>
@@ -1023,11 +1113,15 @@
         </w:tabs>
         <w:spacing w:after="0" w:line="240" w:lineRule="auto"/>
         <w:ind w:left="340"/>
+        <w:rPr>
+          <w:lang w:val="es-CL"/>
+        </w:rPr>
       </w:pPr>
       <w:r>
         <w:rPr>
           <w:sz w:val="19"/>
           <w:szCs w:val="19"/>
+          <w:lang w:val="es-CL"/>
         </w:rPr>
         <w:t>5.1 Resumen de ejecución</w:t>
       </w:r>
@@ -1035,6 +1129,7 @@
         <w:rPr>
           <w:sz w:val="19"/>
           <w:szCs w:val="19"/>
+          <w:lang w:val="es-CL"/>
         </w:rPr>
         <w:tab/>
         <w:t>24</w:t>
@@ -1047,11 +1142,15 @@
         </w:tabs>
         <w:spacing w:after="0" w:line="240" w:lineRule="auto"/>
         <w:ind w:left="340"/>
+        <w:rPr>
+          <w:lang w:val="es-CL"/>
+        </w:rPr>
       </w:pPr>
       <w:r>
         <w:rPr>
           <w:sz w:val="19"/>
           <w:szCs w:val="19"/>
+          <w:lang w:val="es-CL"/>
         </w:rPr>
         <w:t>5.2 Detalle de ejecución de casos</w:t>
       </w:r>
@@ -1059,6 +1158,7 @@
         <w:rPr>
           <w:sz w:val="19"/>
           <w:szCs w:val="19"/>
+          <w:lang w:val="es-CL"/>
         </w:rPr>
         <w:tab/>
         <w:t>26</w:t>
@@ -1071,11 +1171,15 @@
         </w:tabs>
         <w:spacing w:after="0" w:line="240" w:lineRule="auto"/>
         <w:ind w:left="340"/>
+        <w:rPr>
+          <w:lang w:val="es-CL"/>
+        </w:rPr>
       </w:pPr>
       <w:r>
         <w:rPr>
           <w:sz w:val="19"/>
           <w:szCs w:val="19"/>
+          <w:lang w:val="es-CL"/>
         </w:rPr>
         <w:t>5.3 Criticidad de incidentes</w:t>
       </w:r>
@@ -1083,6 +1187,7 @@
         <w:rPr>
           <w:sz w:val="19"/>
           <w:szCs w:val="19"/>
+          <w:lang w:val="es-CL"/>
         </w:rPr>
         <w:tab/>
         <w:t>36</w:t>
@@ -1095,11 +1200,15 @@
         </w:tabs>
         <w:spacing w:after="0" w:line="240" w:lineRule="auto"/>
         <w:ind w:left="340"/>
+        <w:rPr>
+          <w:lang w:val="es-CL"/>
+        </w:rPr>
       </w:pPr>
       <w:r>
         <w:rPr>
           <w:sz w:val="19"/>
           <w:szCs w:val="19"/>
+          <w:lang w:val="es-CL"/>
         </w:rPr>
         <w:t>5.4 Análisis estático con SonarQube</w:t>
       </w:r>
@@ -1107,6 +1216,7 @@
         <w:rPr>
           <w:sz w:val="19"/>
           <w:szCs w:val="19"/>
+          <w:lang w:val="es-CL"/>
         </w:rPr>
         <w:tab/>
         <w:t>38</w:t>
@@ -1118,12 +1228,16 @@
           <w:tab w:val="right" w:leader="dot" w:pos="9071"/>
         </w:tabs>
         <w:spacing w:after="0" w:line="240" w:lineRule="auto"/>
+        <w:rPr>
+          <w:lang w:val="es-CL"/>
+        </w:rPr>
       </w:pPr>
       <w:r>
         <w:rPr>
           <w:b/>
           <w:sz w:val="19"/>
           <w:szCs w:val="19"/>
+          <w:lang w:val="es-CL"/>
         </w:rPr>
         <w:t>6. Análisis ético y normativo de los resultados</w:t>
       </w:r>
@@ -1132,6 +1246,7 @@
           <w:b/>
           <w:sz w:val="19"/>
           <w:szCs w:val="19"/>
+          <w:lang w:val="es-CL"/>
         </w:rPr>
         <w:tab/>
         <w:t>46</w:t>
@@ -1144,11 +1259,15 @@
         </w:tabs>
         <w:spacing w:after="0" w:line="240" w:lineRule="auto"/>
         <w:ind w:left="340"/>
+        <w:rPr>
+          <w:lang w:val="es-CL"/>
+        </w:rPr>
       </w:pPr>
       <w:r>
         <w:rPr>
           <w:sz w:val="19"/>
           <w:szCs w:val="19"/>
+          <w:lang w:val="es-CL"/>
         </w:rPr>
         <w:t>6.1 Enfoque</w:t>
       </w:r>
@@ -1156,6 +1275,7 @@
         <w:rPr>
           <w:sz w:val="19"/>
           <w:szCs w:val="19"/>
+          <w:lang w:val="es-CL"/>
         </w:rPr>
         <w:tab/>
         <w:t>46</w:t>
@@ -1168,11 +1288,15 @@
         </w:tabs>
         <w:spacing w:after="0" w:line="240" w:lineRule="auto"/>
         <w:ind w:left="340"/>
+        <w:rPr>
+          <w:lang w:val="es-CL"/>
+        </w:rPr>
       </w:pPr>
       <w:r>
         <w:rPr>
           <w:sz w:val="19"/>
           <w:szCs w:val="19"/>
+          <w:lang w:val="es-CL"/>
         </w:rPr>
         <w:t>6.2 Marco normativo aplicable</w:t>
       </w:r>
@@ -1180,6 +1304,7 @@
         <w:rPr>
           <w:sz w:val="19"/>
           <w:szCs w:val="19"/>
+          <w:lang w:val="es-CL"/>
         </w:rPr>
         <w:tab/>
         <w:t>46</w:t>
@@ -1192,11 +1317,15 @@
         </w:tabs>
         <w:spacing w:after="0" w:line="240" w:lineRule="auto"/>
         <w:ind w:left="340"/>
+        <w:rPr>
+          <w:lang w:val="es-CL"/>
+        </w:rPr>
       </w:pPr>
       <w:r>
         <w:rPr>
           <w:sz w:val="19"/>
           <w:szCs w:val="19"/>
+          <w:lang w:val="es-CL"/>
         </w:rPr>
         <w:t>6.3 Tensión entre el ERS y la ley</w:t>
       </w:r>
@@ -1204,6 +1333,7 @@
         <w:rPr>
           <w:sz w:val="19"/>
           <w:szCs w:val="19"/>
+          <w:lang w:val="es-CL"/>
         </w:rPr>
         <w:tab/>
         <w:t>48</w:t>
@@ -1216,11 +1346,15 @@
         </w:tabs>
         <w:spacing w:after="0" w:line="240" w:lineRule="auto"/>
         <w:ind w:left="340"/>
+        <w:rPr>
+          <w:lang w:val="es-CL"/>
+        </w:rPr>
       </w:pPr>
       <w:r>
         <w:rPr>
           <w:sz w:val="19"/>
           <w:szCs w:val="19"/>
+          <w:lang w:val="es-CL"/>
         </w:rPr>
         <w:t>6.4 Hallazgos y deber legal afectado</w:t>
       </w:r>
@@ -1228,6 +1362,7 @@
         <w:rPr>
           <w:sz w:val="19"/>
           <w:szCs w:val="19"/>
+          <w:lang w:val="es-CL"/>
         </w:rPr>
         <w:tab/>
         <w:t>48</w:t>
@@ -1240,11 +1375,15 @@
         </w:tabs>
         <w:spacing w:after="0" w:line="240" w:lineRule="auto"/>
         <w:ind w:left="340"/>
+        <w:rPr>
+          <w:lang w:val="es-CL"/>
+        </w:rPr>
       </w:pPr>
       <w:r>
         <w:rPr>
           <w:sz w:val="19"/>
           <w:szCs w:val="19"/>
+          <w:lang w:val="es-CL"/>
         </w:rPr>
         <w:t>6.5 Lectura ética</w:t>
       </w:r>
@@ -1252,6 +1391,7 @@
         <w:rPr>
           <w:sz w:val="19"/>
           <w:szCs w:val="19"/>
+          <w:lang w:val="es-CL"/>
         </w:rPr>
         <w:tab/>
         <w:t>50</w:t>
@@ -1264,11 +1404,15 @@
         </w:tabs>
         <w:spacing w:after="0" w:line="240" w:lineRule="auto"/>
         <w:ind w:left="340"/>
+        <w:rPr>
+          <w:lang w:val="es-CL"/>
+        </w:rPr>
       </w:pPr>
       <w:r>
         <w:rPr>
           <w:sz w:val="19"/>
           <w:szCs w:val="19"/>
+          <w:lang w:val="es-CL"/>
         </w:rPr>
         <w:t>6.6 Dictamen</w:t>
       </w:r>
@@ -1276,6 +1420,7 @@
         <w:rPr>
           <w:sz w:val="19"/>
           <w:szCs w:val="19"/>
+          <w:lang w:val="es-CL"/>
         </w:rPr>
         <w:tab/>
         <w:t>50</w:t>
@@ -1288,11 +1433,15 @@
         </w:tabs>
         <w:spacing w:after="0" w:line="240" w:lineRule="auto"/>
         <w:ind w:left="340"/>
+        <w:rPr>
+          <w:lang w:val="es-CL"/>
+        </w:rPr>
       </w:pPr>
       <w:r>
         <w:rPr>
           <w:sz w:val="19"/>
           <w:szCs w:val="19"/>
+          <w:lang w:val="es-CL"/>
         </w:rPr>
         <w:t>6.7 Recomendaciones</w:t>
       </w:r>
@@ -1300,6 +1449,7 @@
         <w:rPr>
           <w:sz w:val="19"/>
           <w:szCs w:val="19"/>
+          <w:lang w:val="es-CL"/>
         </w:rPr>
         <w:tab/>
         <w:t>51</w:t>
@@ -1311,12 +1461,16 @@
           <w:tab w:val="right" w:leader="dot" w:pos="9071"/>
         </w:tabs>
         <w:spacing w:after="0" w:line="240" w:lineRule="auto"/>
+        <w:rPr>
+          <w:lang w:val="es-CL"/>
+        </w:rPr>
       </w:pPr>
       <w:r>
         <w:rPr>
           <w:b/>
           <w:sz w:val="19"/>
           <w:szCs w:val="19"/>
+          <w:lang w:val="es-CL"/>
         </w:rPr>
         <w:t>7. Conclusiones</w:t>
       </w:r>
@@ -1325,6 +1479,7 @@
           <w:b/>
           <w:sz w:val="19"/>
           <w:szCs w:val="19"/>
+          <w:lang w:val="es-CL"/>
         </w:rPr>
         <w:tab/>
         <w:t>53</w:t>
@@ -1336,12 +1491,16 @@
           <w:tab w:val="right" w:leader="dot" w:pos="9071"/>
         </w:tabs>
         <w:spacing w:after="0" w:line="240" w:lineRule="auto"/>
+        <w:rPr>
+          <w:lang w:val="es-CL"/>
+        </w:rPr>
       </w:pPr>
       <w:r>
         <w:rPr>
           <w:b/>
           <w:sz w:val="19"/>
           <w:szCs w:val="19"/>
+          <w:lang w:val="es-CL"/>
         </w:rPr>
         <w:t>8. Referencias</w:t>
       </w:r>
@@ -1350,6 +1509,7 @@
           <w:b/>
           <w:sz w:val="19"/>
           <w:szCs w:val="19"/>
+          <w:lang w:val="es-CL"/>
         </w:rPr>
         <w:tab/>
         <w:t>54</w:t>
@@ -1361,12 +1521,16 @@
           <w:tab w:val="right" w:leader="dot" w:pos="9071"/>
         </w:tabs>
         <w:spacing w:after="0" w:line="240" w:lineRule="auto"/>
+        <w:rPr>
+          <w:lang w:val="es-CL"/>
+        </w:rPr>
       </w:pPr>
       <w:r>
         <w:rPr>
           <w:b/>
           <w:sz w:val="19"/>
           <w:szCs w:val="19"/>
+          <w:lang w:val="es-CL"/>
         </w:rPr>
         <w:t>Anexo A. Correcciones respecto de la EV1</w:t>
       </w:r>
@@ -1375,6 +1539,7 @@
           <w:b/>
           <w:sz w:val="19"/>
           <w:szCs w:val="19"/>
+          <w:lang w:val="es-CL"/>
         </w:rPr>
         <w:tab/>
         <w:t>55</w:t>
@@ -1386,12 +1551,16 @@
           <w:tab w:val="right" w:leader="dot" w:pos="9071"/>
         </w:tabs>
         <w:spacing w:after="0" w:line="240" w:lineRule="auto"/>
+        <w:rPr>
+          <w:lang w:val="es-CL"/>
+        </w:rPr>
       </w:pPr>
       <w:r>
         <w:rPr>
           <w:b/>
           <w:sz w:val="19"/>
           <w:szCs w:val="19"/>
+          <w:lang w:val="es-CL"/>
         </w:rPr>
         <w:t>Anexo B. Evidencias de la EV1 y del ciclo 2</w:t>
       </w:r>
@@ -1400,6 +1569,7 @@
           <w:b/>
           <w:sz w:val="19"/>
           <w:szCs w:val="19"/>
+          <w:lang w:val="es-CL"/>
         </w:rPr>
         <w:tab/>
         <w:t>55</w:t>
@@ -1531,10 +1701,14 @@
           <w:p>
             <w:pPr>
               <w:spacing w:before="20" w:after="20" w:line="240" w:lineRule="auto"/>
-            </w:pPr>
-            <w:r>
-              <w:rPr>
-                <w:sz w:val="20"/>
+              <w:rPr>
+                <w:lang w:val="es-CL"/>
+              </w:rPr>
+            </w:pPr>
+            <w:r>
+              <w:rPr>
+                <w:sz w:val="20"/>
+                <w:lang w:val="es-CL"/>
               </w:rPr>
               <w:t>Interfaz de programación de aplicaciones</w:t>
             </w:r>
@@ -1615,10 +1789,14 @@
           <w:p>
             <w:pPr>
               <w:spacing w:before="20" w:after="20" w:line="240" w:lineRule="auto"/>
-            </w:pPr>
-            <w:r>
-              <w:rPr>
-                <w:sz w:val="20"/>
+              <w:rPr>
+                <w:lang w:val="es-CL"/>
+              </w:rPr>
+            </w:pPr>
+            <w:r>
+              <w:rPr>
+                <w:sz w:val="20"/>
+                <w:lang w:val="es-CL"/>
               </w:rPr>
               <w:t>Cross-Origin Resource Sharing, intercambio de recursos entre orígenes</w:t>
             </w:r>
@@ -1699,10 +1877,14 @@
           <w:p>
             <w:pPr>
               <w:spacing w:before="20" w:after="20" w:line="240" w:lineRule="auto"/>
-            </w:pPr>
-            <w:r>
-              <w:rPr>
-                <w:sz w:val="20"/>
+              <w:rPr>
+                <w:lang w:val="es-CL"/>
+              </w:rPr>
+            </w:pPr>
+            <w:r>
+              <w:rPr>
+                <w:sz w:val="20"/>
+                <w:lang w:val="es-CL"/>
               </w:rPr>
               <w:t>Crear, leer, actualizar y eliminar</w:t>
             </w:r>
@@ -1741,10 +1923,14 @@
           <w:p>
             <w:pPr>
               <w:spacing w:before="20" w:after="20" w:line="240" w:lineRule="auto"/>
-            </w:pPr>
-            <w:r>
-              <w:rPr>
-                <w:sz w:val="20"/>
+              <w:rPr>
+                <w:lang w:val="es-CL"/>
+              </w:rPr>
+            </w:pPr>
+            <w:r>
+              <w:rPr>
+                <w:sz w:val="20"/>
+                <w:lang w:val="es-CL"/>
               </w:rPr>
               <w:t>Equipo de respuesta ante incidentes de seguridad informática</w:t>
             </w:r>
@@ -1783,10 +1969,14 @@
           <w:p>
             <w:pPr>
               <w:spacing w:before="20" w:after="20" w:line="240" w:lineRule="auto"/>
-            </w:pPr>
-            <w:r>
-              <w:rPr>
-                <w:sz w:val="20"/>
+              <w:rPr>
+                <w:lang w:val="es-CL"/>
+              </w:rPr>
+            </w:pPr>
+            <w:r>
+              <w:rPr>
+                <w:sz w:val="20"/>
+                <w:lang w:val="es-CL"/>
               </w:rPr>
               <w:t>Content Security Policy, política de seguridad de contenido</w:t>
             </w:r>
@@ -1825,10 +2015,14 @@
           <w:p>
             <w:pPr>
               <w:spacing w:before="20" w:after="20" w:line="240" w:lineRule="auto"/>
-            </w:pPr>
-            <w:r>
-              <w:rPr>
-                <w:sz w:val="20"/>
+              <w:rPr>
+                <w:lang w:val="es-CL"/>
+              </w:rPr>
+            </w:pPr>
+            <w:r>
+              <w:rPr>
+                <w:sz w:val="20"/>
+                <w:lang w:val="es-CL"/>
               </w:rPr>
               <w:t>Pruebas dinámicas de seguridad de aplicaciones</w:t>
             </w:r>
@@ -1867,10 +2061,14 @@
           <w:p>
             <w:pPr>
               <w:spacing w:before="20" w:after="20" w:line="240" w:lineRule="auto"/>
-            </w:pPr>
-            <w:r>
-              <w:rPr>
-                <w:sz w:val="20"/>
+              <w:rPr>
+                <w:lang w:val="es-CL"/>
+              </w:rPr>
+            </w:pPr>
+            <w:r>
+              <w:rPr>
+                <w:sz w:val="20"/>
+                <w:lang w:val="es-CL"/>
               </w:rPr>
               <w:t>Decreto con fuerza de ley</w:t>
             </w:r>
@@ -1951,10 +2149,14 @@
           <w:p>
             <w:pPr>
               <w:spacing w:before="20" w:after="20" w:line="240" w:lineRule="auto"/>
-            </w:pPr>
-            <w:r>
-              <w:rPr>
-                <w:sz w:val="20"/>
+              <w:rPr>
+                <w:lang w:val="es-CL"/>
+              </w:rPr>
+            </w:pPr>
+            <w:r>
+              <w:rPr>
+                <w:sz w:val="20"/>
+                <w:lang w:val="es-CL"/>
               </w:rPr>
               <w:t>Especificación de requerimientos de software</w:t>
             </w:r>
@@ -2035,10 +2237,14 @@
           <w:p>
             <w:pPr>
               <w:spacing w:before="20" w:after="20" w:line="240" w:lineRule="auto"/>
-            </w:pPr>
-            <w:r>
-              <w:rPr>
-                <w:sz w:val="20"/>
+              <w:rPr>
+                <w:lang w:val="es-CL"/>
+              </w:rPr>
+            </w:pPr>
+            <w:r>
+              <w:rPr>
+                <w:sz w:val="20"/>
+                <w:lang w:val="es-CL"/>
               </w:rPr>
               <w:t>Protocolo de transferencia de hipertexto / versión segura sobre TLS</w:t>
             </w:r>
@@ -2077,10 +2283,14 @@
           <w:p>
             <w:pPr>
               <w:spacing w:before="20" w:after="20" w:line="240" w:lineRule="auto"/>
-            </w:pPr>
-            <w:r>
-              <w:rPr>
-                <w:sz w:val="20"/>
+              <w:rPr>
+                <w:lang w:val="es-CL"/>
+              </w:rPr>
+            </w:pPr>
+            <w:r>
+              <w:rPr>
+                <w:sz w:val="20"/>
+                <w:lang w:val="es-CL"/>
               </w:rPr>
               <w:t>Incidente registrado en la ejecución</w:t>
             </w:r>
@@ -2203,10 +2413,14 @@
           <w:p>
             <w:pPr>
               <w:spacing w:before="20" w:after="20" w:line="240" w:lineRule="auto"/>
-            </w:pPr>
-            <w:r>
-              <w:rPr>
-                <w:sz w:val="20"/>
+              <w:rPr>
+                <w:lang w:val="es-CL"/>
+              </w:rPr>
+            </w:pPr>
+            <w:r>
+              <w:rPr>
+                <w:sz w:val="20"/>
+                <w:lang w:val="es-CL"/>
               </w:rPr>
               <w:t>Multi-Quality Rule, modo de clasificación de SonarQube</w:t>
             </w:r>
@@ -2245,10 +2459,14 @@
           <w:p>
             <w:pPr>
               <w:spacing w:before="20" w:after="20" w:line="240" w:lineRule="auto"/>
-            </w:pPr>
-            <w:r>
-              <w:rPr>
-                <w:sz w:val="20"/>
+              <w:rPr>
+                <w:lang w:val="es-CL"/>
+              </w:rPr>
+            </w:pPr>
+            <w:r>
+              <w:rPr>
+                <w:sz w:val="20"/>
+                <w:lang w:val="es-CL"/>
               </w:rPr>
               <w:t>Requisito no funcional del ERS</w:t>
             </w:r>
@@ -2371,10 +2589,14 @@
           <w:p>
             <w:pPr>
               <w:spacing w:before="20" w:after="20" w:line="240" w:lineRule="auto"/>
-            </w:pPr>
-            <w:r>
-              <w:rPr>
-                <w:sz w:val="20"/>
+              <w:rPr>
+                <w:lang w:val="es-CL"/>
+              </w:rPr>
+            </w:pPr>
+            <w:r>
+              <w:rPr>
+                <w:sz w:val="20"/>
+                <w:lang w:val="es-CL"/>
               </w:rPr>
               <w:t>Niveles de prioridad por riesgo (sección 3.1)</w:t>
             </w:r>
@@ -2939,19 +3161,7 @@
         <w:rPr>
           <w:lang w:val="es-CL"/>
         </w:rPr>
-        <w:t>Cuidarte+ es una plataforma web para centros de salud desarrollada por CreaLab SpA</w:t>
-      </w:r>
-      <w:r>
-        <w:rPr>
-          <w:lang w:val="es-CL"/>
-        </w:rPr>
-        <w:t xml:space="preserve"> y corresponde al Caso B de la asignatura. Permite que los médicos registren pacientes y exámenes, que los pacientes revisen y descarguen sus documentos clínicos y que los administradores gestionen usuarios y revisen la auditoría. Está construida como una aplicación de una sola página (SPA) en React que consume una interfaz de programación de aplicaciones (API) REST en Express sobre una base de datos PostgreSQL. Para esta evaluación se ejecuta en contenedores Docker en los equipos del grupo: el frontend</w:t>
-      </w:r>
-      <w:r>
-        <w:rPr>
-          <w:lang w:val="es-CL"/>
-        </w:rPr>
-        <w:t xml:space="preserve"> en el puerto 3333, la API en el 4444 (con la documentación Swagger en /docs) y la base de datos en el 15442.</w:t>
+        <w:t>Cuidarte+ es una plataforma web para centros de salud desarrollada por CreaLab SpA y corresponde al Caso B de la asignatura. Permite que los médicos registren pacientes y exámenes, que los pacientes revisen y descarguen sus documentos clínicos y que los administradores gestionen usuarios y revisen la auditoría. Está construida como una aplicación de una sola página (SPA) en React que consume una interfaz de programación de aplicaciones (API) REST en Express sobre una base de datos PostgreSQL. Para esta evaluación se ejecuta en contenedores Docker en los equipos del grupo: el frontend en el puerto 3333, la API en el 4444 (con la documentación Swagger en /docs) y la base de datos en el 15442.</w:t>
       </w:r>
     </w:p>
     <w:p>
@@ -2993,13 +3203,7 @@
         <w:rPr>
           <w:lang w:val="es-CL"/>
         </w:rPr>
-        <w:t>En la primera evaluación parcial (EV1) diseñamos el plan de pruebas y seis casos representativos. Este informe continúa ese trabajo con tres cambios. Primero, la cobertura pasa de 14 a los 40 códigos de la especificación de requerimientos de software del Caso B (ERS B), cada uno con su caso de prueba. Segundo, los casos se ejecutan en el ambiente Docker y se registran con evidencia, resultado e incidentes clasificados por criticidad. Tercero, el análisis normativo incorpora la normativa sanitaria que faltab</w:t>
-      </w:r>
-      <w:r>
-        <w:rPr>
-          <w:lang w:val="es-CL"/>
-        </w:rPr>
-        <w:t>a en la EV1 (derechos de los pacientes, ficha clínica y atención de urgencia) y separa las normas vigentes de las que entran en vigencia más adelante. Estos ajustes responden a la retroalimentación que recibimos del docente sobre la EV1, y su detalle está en el Anexo A.</w:t>
+        <w:t>En la primera evaluación parcial (EV1) diseñamos el plan de pruebas y seis casos representativos. Este informe continúa ese trabajo con tres cambios. Primero, la cobertura pasa de 14 a los 40 códigos de la especificación de requerimientos de software del Caso B (ERS B), cada uno con su caso de prueba. Segundo, los casos se ejecutan en el ambiente Docker y se registran con evidencia, resultado e incidentes clasificados por criticidad. Tercero, el análisis normativo incorpora la normativa sanitaria que faltaba en la EV1 (derechos de los pacientes, ficha clínica y atención de urgencia) y separa las normas vigentes de las que entran en vigencia más adelante. Estos ajustes responden a la retroalimentación que recibimos del docente sobre la EV1, y su detalle está en el Anexo A.</w:t>
       </w:r>
     </w:p>
     <w:p>
@@ -3178,13 +3382,7 @@
         <w:rPr>
           <w:lang w:val="es-CL"/>
         </w:rPr>
-        <w:t>Quedan dentro del alcance todos los módulos del ERS B: autenticación y sesión, registro de usuarios, gestión de pacientes, exámenes y documentos, visualización por parte del paciente, auditoría y administración de usuarios y roles, además de los atributos de seguridad, rendimiento, usabilidad, disponibilidad y compatibilidad. Las pruebas se hacen solo sobre la instalación local en Docker y con datos sintéticos. Quedan fuera un pentest</w:t>
-      </w:r>
-      <w:r>
-        <w:rPr>
-          <w:lang w:val="es-CL"/>
-        </w:rPr>
-        <w:t xml:space="preserve"> certificado por terceros, la certificación formal WCAG, una auditoría legal externa y la medición de disponibilidad durante un mes completo; para NFR-DIS-1 se revisa la configuración y la documentación, no el uptime real.</w:t>
+        <w:t>Quedan dentro del alcance todos los módulos del ERS B: autenticación y sesión, registro de usuarios, gestión de pacientes, exámenes y documentos, visualización por parte del paciente, auditoría y administración de usuarios y roles, además de los atributos de seguridad, rendimiento, usabilidad, disponibilidad y compatibilidad. Las pruebas se hacen solo sobre la instalación local en Docker y con datos sintéticos. Quedan fuera un pentest certificado por terceros, la certificación formal WCAG, una auditoría legal externa y la medición de disponibilidad durante un mes completo; para NFR-DIS-1 se revisa la configuración y la documentación, no el uptime real.</w:t>
       </w:r>
     </w:p>
     <w:p>
@@ -3226,13 +3424,7 @@
         <w:rPr>
           <w:lang w:val="es-CL"/>
         </w:rPr>
-        <w:t>El informe se organiza en siete secciones y dos anexos. La sección 2 define los criterios de calidad, seguridad y cumplimiento; la sección 3 presenta el plan de pruebas (estrategia, tipos de prueba, criterios de aceptación y herramientas); la sección 4 contiene la matriz de trazabilidad y el diseño de los casos; la sección 5 muestra la ejecución, con el resumen, el detalle por caso, la criticidad de los incidentes y el análisis estático; la sección 6 desarrolla el análisis ético y normativo de los resultado</w:t>
-      </w:r>
-      <w:r>
-        <w:rPr>
-          <w:lang w:val="es-CL"/>
-        </w:rPr>
-        <w:t>s, y la sección 7 cierra con las conclusiones. Al final se incluyen las correcciones respecto de la EV1 (Anexo A) y la lista de evidencias de la EV1 y del ciclo 2 (Anexo B).</w:t>
+        <w:t>El informe se organiza en siete secciones y dos anexos. La sección 2 define los criterios de calidad, seguridad y cumplimiento; la sección 3 presenta el plan de pruebas (estrategia, tipos de prueba, criterios de aceptación y herramientas); la sección 4 contiene la matriz de trazabilidad y el diseño de los casos; la sección 5 muestra la ejecución, con el resumen, el detalle por caso, la criticidad de los incidentes y el análisis estático; la sección 6 desarrolla el análisis ético y normativo de los resultados, y la sección 7 cierra con las conclusiones. Al final se incluyen las correcciones respecto de la EV1 (Anexo A) y la lista de evidencias de la EV1 y del ciclo 2 (Anexo B).</w:t>
       </w:r>
     </w:p>
     <w:p>
@@ -3260,14 +3452,7 @@
         <w:rPr>
           <w:lang w:val="es-CL"/>
         </w:rPr>
-        <w:t xml:space="preserve">Los criterios de esta sección son el estándar contra el que se evalúa Cuidarte+. Provienen de tres fuentes: el modelo de calidad ISO/IEC 25010, los requisitos no funcionales del ERS </w:t>
-      </w:r>
-      <w:r>
-        <w:rPr>
-          <w:lang w:val="es-CL"/>
-        </w:rPr>
-        <w:lastRenderedPageBreak/>
-        <w:t>B y la normativa chilena que regula el tratamiento de datos de salud. Cada criterio se asocia a los códigos del ERS que lo sustentan y al caso de prueba que lo verifica.</w:t>
+        <w:t>Los criterios de esta sección son el estándar contra el que se evalúa Cuidarte+. Provienen de tres fuentes: el modelo de calidad ISO/IEC 25010, los requisitos no funcionales del ERS B y la normativa chilena que regula el tratamiento de datos de salud. Cada criterio se asocia a los códigos del ERS que lo sustentan y al caso de prueba que lo verifica.</w:t>
       </w:r>
     </w:p>
     <w:p>
@@ -4607,7 +4792,6 @@
               <w:rPr>
                 <w:sz w:val="20"/>
               </w:rPr>
-              <w:lastRenderedPageBreak/>
               <w:t>NFR-SEG-8</w:t>
             </w:r>
           </w:p>
@@ -5477,20 +5661,7 @@
         <w:rPr>
           <w:lang w:val="es-CL"/>
         </w:rPr>
-        <w:t xml:space="preserve">Usamos un enfoque mixto. En el plan, la automatización cubría lo que conviene repetir o medir con precisión, es decir, los flujos principales con Selenium, la carga y el tiempo de </w:t>
-      </w:r>
-      <w:r>
-        <w:rPr>
-          <w:lang w:val="es-CL"/>
-        </w:rPr>
-        <w:lastRenderedPageBreak/>
-        <w:t>respuesta con JMeter, el análisis dinámico con OWASP ZAP y Nikto, la búsqueda de inyección SQL con SQLMap y el análisis estático con SonarQube. En la ejecución se usaron SonarQube, OWASP ZAP con sesión, SQLMap, John the Ripper, JMeter y Lighthouse. El 27 de octubre de 2026 se ejecutó con Selenium una suite de 11 pruebas de interfaz, organizada con pytest y Page Objects, que recorrió login, logout, pacientes, exámenes, acceso por rol y Mis Resultados en CP-01, 02, 07, 08, 10, 11 y 12. Las 11 pasaron. Los cas</w:t>
-      </w:r>
-      <w:r>
-        <w:rPr>
-          <w:lang w:val="es-CL"/>
-        </w:rPr>
-        <w:t>os negativos y el control de acceso en la API se verificaron con Postman y de forma manual. Burp Suite y Nikto no se usaron, y en su lugar las peticiones y las cabeceras se revisaron con Swagger y curl. Dejamos en manual lo que necesita criterio humano, como la usabilidad con personas mayores, la revisión de mensajes de error y las verificaciones de configuración (TLS, cifrado y respaldo).</w:t>
+        <w:t>Usamos un enfoque mixto. En el plan, la automatización cubría lo que conviene repetir o medir con precisión, es decir, los flujos principales con Selenium, la carga y el tiempo de respuesta con JMeter, el análisis dinámico con OWASP ZAP y Nikto, la búsqueda de inyección SQL con SQLMap y el análisis estático con SonarQube. En la ejecución se usaron SonarQube, OWASP ZAP con sesión, SQLMap, John the Ripper, JMeter y Lighthouse. El 27 de octubre de 2026 se ejecutó con Selenium una suite de 11 pruebas de interfaz, organizada con pytest y Page Objects, que recorrió login, logout, pacientes, exámenes, acceso por rol y Mis Resultados en CP-01, 02, 07, 08, 10, 11 y 12. Las 11 pasaron. Los casos negativos y el control de acceso en la API se verificaron con Postman y de forma manual. Burp Suite y Nikto no se usaron, y en su lugar las peticiones y las cabeceras se revisaron con Swagger y curl. Dejamos en manual lo que necesita criterio humano, como la usabilidad con personas mayores, la revisión de mensajes de error y las verificaciones de configuración (TLS, cifrado y respaldo).</w:t>
       </w:r>
     </w:p>
     <w:p>
@@ -6211,14 +6382,7 @@
         <w:rPr>
           <w:lang w:val="es-CL"/>
         </w:rPr>
-        <w:t xml:space="preserve">Mantenemos la priorización por riesgo de la EV1. P0 agrupa autenticación, control de acceso y documentos clínicos, donde una falla expone datos de salud. P1 cubre auditoría, registros y respaldo, que son la evidencia que el centro necesita ante un incidente. P2 es el CRUD clínico, núcleo del negocio. P3 corresponde a rendimiento y disponibilidad, que tienen umbrales numéricos en el ERS, y P4 a usabilidad y compatibilidad. Si falta tiempo, se </w:t>
-      </w:r>
-      <w:r>
-        <w:rPr>
-          <w:lang w:val="es-CL"/>
-        </w:rPr>
-        <w:lastRenderedPageBreak/>
-        <w:t>ejecuta primero todo P0 y P1; un caso P3 o P4 sin ejecutar se informa como No ejecutado y nunca como aprobado.</w:t>
+        <w:t>Mantenemos la priorización por riesgo de la EV1. P0 agrupa autenticación, control de acceso y documentos clínicos, donde una falla expone datos de salud. P1 cubre auditoría, registros y respaldo, que son la evidencia que el centro necesita ante un incidente. P2 es el CRUD clínico, núcleo del negocio. P3 corresponde a rendimiento y disponibilidad, que tienen umbrales numéricos en el ERS, y P4 a usabilidad y compatibilidad. Si falta tiempo, se ejecuta primero todo P0 y P1; un caso P3 o P4 sin ejecutar se informa como No ejecutado y nunca como aprobado.</w:t>
       </w:r>
     </w:p>
     <w:p>
@@ -6714,7 +6878,6 @@
               <w:rPr>
                 <w:sz w:val="20"/>
               </w:rPr>
-              <w:lastRenderedPageBreak/>
               <w:t>Seguridad estática</w:t>
             </w:r>
           </w:p>
@@ -7170,13 +7333,7 @@
         <w:rPr>
           <w:lang w:val="es-CL"/>
         </w:rPr>
-        <w:t>Priorizamos seguridad, auditoría y usabilidad porque Cuidarte+ maneja datos sensibles de salud y está orientado a personas mayores. El rendimiento se incluye porque el ERS fija umbrales medibles y porque el acceso oportuno a un examen tiene relevancia clínica, por ejemplo durante una urgencia. La combinación de análisis estático y dinámico se justifica porque cada uno detecta cosas distintas: SonarQube encuentra un secreto escrito en el código aunque nadie lo use, y ZAP encuentra una cabecera de seguridad f</w:t>
-      </w:r>
-      <w:r>
-        <w:rPr>
-          <w:lang w:val="es-CL"/>
-        </w:rPr>
-        <w:t>altante que no se ve en el código.</w:t>
+        <w:t>Priorizamos seguridad, auditoría y usabilidad porque Cuidarte+ maneja datos sensibles de salud y está orientado a personas mayores. El rendimiento se incluye porque el ERS fija umbrales medibles y porque el acceso oportuno a un examen tiene relevancia clínica, por ejemplo durante una urgencia. La combinación de análisis estático y dinámico se justifica porque cada uno detecta cosas distintas: SonarQube encuentra un secreto escrito en el código aunque nadie lo use, y ZAP encuentra una cabecera de seguridad faltante que no se ve en el código.</w:t>
       </w:r>
     </w:p>
     <w:p>
@@ -7555,7 +7712,6 @@
           <w:b/>
           <w:lang w:val="es-CL"/>
         </w:rPr>
-        <w:lastRenderedPageBreak/>
         <w:t xml:space="preserve">Funcionales. </w:t>
       </w:r>
       <w:r>
@@ -7583,13 +7739,7 @@
         <w:rPr>
           <w:lang w:val="es-CL"/>
         </w:rPr>
-        <w:t xml:space="preserve">En seguridad, la auditoría con lista de verificación y las pruebas de penetración no deben mostrar hallazgos críticos (ERS §3.3.1). En rendimiento, el CRUD simple debe responder bajo 300 ms en el percentil 95 con carga normal, la página principal </w:t>
-      </w:r>
-      <w:r>
-        <w:rPr>
-          <w:lang w:val="es-CL"/>
-        </w:rPr>
-        <w:t>debe cargar en menos de 2 segundos y el sistema debe sostener 200 usuarios concurrentes; estas mediciones valen solo con el retraso artificial de 5 segundos desactivado, y la medición con el retraso se informa aparte. En usabilidad, la prueba con cinco usuarios representativos, incluidos adultos mayores, no debe mostrar bloqueos mayores (ERS §3.1.1). En compatibilidad, los flujos principales deben funcionar en las dos últimas versiones de los cuatro navegadores y en vistas de móvil y tablet.</w:t>
+        <w:t>En seguridad, la auditoría con lista de verificación y las pruebas de penetración no deben mostrar hallazgos críticos (ERS §3.3.1). En rendimiento, el CRUD simple debe responder bajo 300 ms en el percentil 95 con carga normal, la página principal debe cargar en menos de 2 segundos y el sistema debe sostener 200 usuarios concurrentes; estas mediciones valen solo con el retraso artificial de 5 segundos desactivado, y la medición con el retraso se informa aparte. En usabilidad, la prueba con cinco usuarios representativos, incluidos adultos mayores, no debe mostrar bloqueos mayores (ERS §3.1.1). En compatibilidad, los flujos principales deben funcionar en las dos últimas versiones de los cuatro navegadores y en vistas de móvil y tablet.</w:t>
       </w:r>
     </w:p>
     <w:p>
@@ -7807,7 +7957,6 @@
               <w:rPr>
                 <w:sz w:val="20"/>
               </w:rPr>
-              <w:lastRenderedPageBreak/>
               <w:t>Selenium</w:t>
             </w:r>
           </w:p>
@@ -8681,7 +8830,6 @@
               <w:rPr>
                 <w:sz w:val="20"/>
               </w:rPr>
-              <w:lastRenderedPageBreak/>
               <w:t>Skarlett Tropan</w:t>
             </w:r>
           </w:p>
@@ -9157,14 +9305,7 @@
                 <w:sz w:val="20"/>
                 <w:lang w:val="es-CL"/>
               </w:rPr>
-              <w:t>Repositorio Barrolas/cuidarte-mas, rama main</w:t>
-            </w:r>
-            <w:r>
-              <w:rPr>
-                <w:sz w:val="20"/>
-                <w:lang w:val="es-CL"/>
-              </w:rPr>
-              <w:t xml:space="preserve"> (commit 7503d1b al iniciar el ciclo y a6028a5 para las evidencias hasta el 27 de octubre de 2026)</w:t>
+              <w:t>Repositorio Barrolas/cuidarte-mas, rama main (commit 7503d1b al iniciar el ciclo y a6028a5 para las evidencias hasta el 27 de octubre de 2026)</w:t>
             </w:r>
           </w:p>
         </w:tc>
@@ -9216,19 +9357,7 @@
         <w:rPr>
           <w:lang w:val="es-CL"/>
         </w:rPr>
-        <w:t>staging</w:t>
-      </w:r>
-      <w:r>
-        <w:rPr>
-          <w:lang w:val="es-CL"/>
-        </w:rPr>
-        <w:t xml:space="preserve"> separado, por lo que las verificaciones que dependen de producción, como TLS con certificado válido o la disponibilidad mensual, se hicieron sobre la configuración del despliegue (la configuración de nginx y de Docker Compose) y se informan con esa limitación. Esa limitación no cambia el resultado de CP-14, que quedó Fallido. El 20 de octubre el frontend y la API respondieron solo por HTTP, sin certificado ni HSTS, y PostgreSQL tiene ssl en off. Las herramientas de seguridad se usaron solo contra esta inst</w:t>
-      </w:r>
-      <w:r>
-        <w:rPr>
-          <w:lang w:val="es-CL"/>
-        </w:rPr>
-        <w:t>alación local.</w:t>
+        <w:t xml:space="preserve"> separado, por lo que las verificaciones que dependen de producción, como TLS con certificado válido o la disponibilidad mensual, se hicieron sobre la configuración del despliegue (la configuración de nginx y de Docker Compose) y se informan con esa limitación. Esa limitación no cambia el resultado de CP-14, que quedó Fallido. El 20 de octubre el frontend y la API respondieron solo por HTTP, sin certificado ni HSTS, y PostgreSQL tiene ssl en off. Las herramientas de seguridad se usaron solo contra esta instalación local.</w:t>
       </w:r>
     </w:p>
     <w:p>
@@ -9242,7 +9371,6 @@
         <w:rPr>
           <w:lang w:val="es-CL"/>
         </w:rPr>
-        <w:lastRenderedPageBreak/>
         <w:t>4. Diseño de casos de prueba</w:t>
       </w:r>
     </w:p>
@@ -11484,7 +11612,6 @@
               <w:rPr>
                 <w:sz w:val="18"/>
               </w:rPr>
-              <w:lastRenderedPageBreak/>
               <w:t>NFR-SEG-2</w:t>
             </w:r>
           </w:p>
@@ -13904,7 +14031,6 @@
           <w:sz w:val="20"/>
           <w:lang w:val="es-CL"/>
         </w:rPr>
-        <w:lastRenderedPageBreak/>
         <w:t xml:space="preserve">Tabla 11. </w:t>
       </w:r>
       <w:r>
@@ -14363,13 +14489,7 @@
         <w:rPr>
           <w:lang w:val="es-CL"/>
         </w:rPr>
-        <w:t>Dos situaciones del ERS se dejan explícitas. RF-4.3 acepta PDF, DOC, PPT, JPG y PNG, pero el filtro de carga del backend</w:t>
-      </w:r>
-      <w:r>
-        <w:rPr>
-          <w:lang w:val="es-CL"/>
-        </w:rPr>
-        <w:t xml:space="preserve"> solo admite PDF, JPG y PNG. Además, RF-4.4 pide guardar los documentos en almacenamiento interno con referencia en la base de datos, mientras que el backend guarda el archivo completo en una columna bytea. CP-13 revisa ambos puntos (INC-15 e INC-16).</w:t>
+        <w:t>Dos situaciones del ERS se dejan explícitas. RF-4.3 acepta PDF, DOC, PPT, JPG y PNG, pero el filtro de carga del backend solo admite PDF, JPG y PNG. Además, RF-4.4 pide guardar los documentos en almacenamiento interno con referencia en la base de datos, mientras que el backend guarda el archivo completo en una columna bytea. CP-13 revisa ambos puntos (INC-15 e INC-16).</w:t>
       </w:r>
     </w:p>
     <w:p>
@@ -15413,7 +15533,6 @@
               <w:rPr>
                 <w:sz w:val="18"/>
               </w:rPr>
-              <w:lastRenderedPageBreak/>
               <w:t>CP-10</w:t>
             </w:r>
           </w:p>
@@ -16758,7 +16877,6 @@
           <w:sz w:val="20"/>
           <w:lang w:val="es-CL"/>
         </w:rPr>
-        <w:lastRenderedPageBreak/>
         <w:t xml:space="preserve">Tabla 13. </w:t>
       </w:r>
       <w:r>
@@ -17590,7 +17708,6 @@
                 <w:color w:val="1F3A5F"/>
                 <w:sz w:val="20"/>
               </w:rPr>
-              <w:lastRenderedPageBreak/>
               <w:t>DESCRIPCIÓN</w:t>
             </w:r>
           </w:p>
@@ -18225,7 +18342,6 @@
                 <w:color w:val="1F3A5F"/>
                 <w:sz w:val="20"/>
               </w:rPr>
-              <w:lastRenderedPageBreak/>
               <w:t>DESCRIPCIÓN</w:t>
             </w:r>
           </w:p>
@@ -18873,7 +18989,6 @@
                 <w:color w:val="1F3A5F"/>
                 <w:sz w:val="20"/>
               </w:rPr>
-              <w:lastRenderedPageBreak/>
               <w:t>DESCRIPCIÓN</w:t>
             </w:r>
           </w:p>
@@ -19521,7 +19636,6 @@
                 <w:color w:val="1F3A5F"/>
                 <w:sz w:val="20"/>
               </w:rPr>
-              <w:lastRenderedPageBreak/>
               <w:t>DESCRIPCIÓN</w:t>
             </w:r>
           </w:p>
@@ -20162,7 +20276,6 @@
                 <w:color w:val="1F3A5F"/>
                 <w:sz w:val="20"/>
               </w:rPr>
-              <w:lastRenderedPageBreak/>
               <w:t>DESCRIPCIÓN</w:t>
             </w:r>
           </w:p>
@@ -20301,14 +20414,7 @@
                 <w:sz w:val="20"/>
                 <w:lang w:val="es-CL"/>
               </w:rPr>
-              <w:t>1. Abrir la aplicación con viewport de 375 px</w:t>
-            </w:r>
-            <w:r>
-              <w:rPr>
-                <w:sz w:val="20"/>
-                <w:lang w:val="es-CL"/>
-              </w:rPr>
-              <w:t>.</w:t>
+              <w:t>1. Abrir la aplicación con viewport de 375 px.</w:t>
             </w:r>
           </w:p>
           <w:p>
@@ -20997,14 +21103,7 @@
                 <w:sz w:val="20"/>
                 <w:lang w:val="es-CL"/>
               </w:rPr>
-              <w:t>4. Repetir GET /examenes</w:t>
-            </w:r>
-            <w:r>
-              <w:rPr>
-                <w:sz w:val="20"/>
-                <w:lang w:val="es-CL"/>
-              </w:rPr>
-              <w:t xml:space="preserve"> con el mismo token.</w:t>
+              <w:t>4. Repetir GET /examenes con el mismo token.</w:t>
             </w:r>
           </w:p>
           <w:p>
@@ -21268,7 +21367,6 @@
           <w:sz w:val="20"/>
           <w:lang w:val="es-CL"/>
         </w:rPr>
-        <w:lastRenderedPageBreak/>
         <w:t xml:space="preserve">Tabla 20. </w:t>
       </w:r>
       <w:r>
@@ -22340,7 +22438,6 @@
               <w:rPr>
                 <w:sz w:val="20"/>
               </w:rPr>
-              <w:lastRenderedPageBreak/>
               <w:t>Resultado por requisito</w:t>
             </w:r>
           </w:p>
@@ -23381,13 +23478,7 @@
         <w:rPr>
           <w:lang w:val="es-CL"/>
         </w:rPr>
-        <w:t>Las tablas 21 y 22 cuadran con la Tabla 24. De los 22 casos ejecutados, 7 se aprueban, 12 fallan y 3 quedan parciales (CP-04, CP-13 y CP-22); los parciales no se cuentan como aprobados ni como fallidos. El único caso sin ejecutar es CP-19, que mide la carga de la página principal y los 200 usuarios concurrentes. Los resultados de Nicolás Barra salen de su bitácora del 20 de octubre de 2026, los de Skarlett Tropan de las capturas y verificaciones del 20 de octubre de 2026 listadas en el Anexo B, los de Ari A</w:t>
-      </w:r>
-      <w:r>
-        <w:rPr>
-          <w:lang w:val="es-CL"/>
-        </w:rPr>
-        <w:t>raya de su bitácora del 26 de octubre de 2026 y el cierre de CP-17 de la revisión del código que hizo Skarlett Tropan el 27 de octubre de 2026. CP-23 es una revisión documental hecha sobre esos resultados.</w:t>
+        <w:t>Las tablas 21 y 22 cuadran con la Tabla 24. De los 22 casos ejecutados, 7 se aprueban, 12 fallan y 3 quedan parciales (CP-04, CP-13 y CP-22); los parciales no se cuentan como aprobados ni como fallidos. El único caso sin ejecutar es CP-19, que mide la carga de la página principal y los 200 usuarios concurrentes. Los resultados de Nicolás Barra salen de su bitácora del 20 de octubre de 2026, los de Skarlett Tropan de las capturas y verificaciones del 20 de octubre de 2026 listadas en el Anexo B, los de Ari Araya de su bitácora del 26 de octubre de 2026 y el cierre de CP-17 de la revisión del código que hizo Skarlett Tropan el 27 de octubre de 2026. CP-23 es una revisión documental hecha sobre esos resultados.</w:t>
       </w:r>
     </w:p>
     <w:p>
@@ -23637,13 +23728,7 @@
               <w:rPr>
                 <w:sz w:val="19"/>
               </w:rPr>
-              <w:t>Informe de hallazgos</w:t>
-            </w:r>
-            <w:r>
-              <w:rPr>
-                <w:sz w:val="19"/>
-              </w:rPr>
-              <w:t xml:space="preserve"> EV1</w:t>
+              <w:t>Informe de hallazgos EV1</w:t>
             </w:r>
           </w:p>
         </w:tc>
@@ -23666,7 +23751,6 @@
               <w:rPr>
                 <w:sz w:val="19"/>
               </w:rPr>
-              <w:lastRenderedPageBreak/>
               <w:t>CP-04</w:t>
             </w:r>
           </w:p>
@@ -24667,7 +24751,6 @@
               <w:rPr>
                 <w:sz w:val="18"/>
               </w:rPr>
-              <w:lastRenderedPageBreak/>
               <w:t>CP-09</w:t>
             </w:r>
           </w:p>
@@ -24855,13 +24938,7 @@
               <w:rPr>
                 <w:sz w:val="18"/>
               </w:rPr>
-              <w:t>Evidencias/CP-10, capturas</w:t>
-            </w:r>
-            <w:r>
-              <w:rPr>
-                <w:sz w:val="18"/>
-              </w:rPr>
-              <w:t xml:space="preserve"> 00 a 03. El 27 oct 2026 la suite de Selenium repitió el listado y la apertura de la edición de pacientes (PAC-01 y PAC-02).</w:t>
+              <w:t>Evidencias/CP-10, capturas 00 a 03. El 27 oct 2026 la suite de Selenium repitió el listado y la apertura de la edición de pacientes (PAC-01 y PAC-02).</w:t>
             </w:r>
           </w:p>
         </w:tc>
@@ -24988,13 +25065,7 @@
               <w:rPr>
                 <w:sz w:val="18"/>
               </w:rPr>
-              <w:t>Evidencias</w:t>
-            </w:r>
-            <w:r>
-              <w:rPr>
-                <w:sz w:val="18"/>
-              </w:rPr>
-              <w:t>/CP-11, capturas 01, 01a y 02. El 27 oct 2026 la suite de Selenium repitió la edición y el guardado de observaciones de un examen (EXA-01 y EXA-02).</w:t>
+              <w:t>Evidencias/CP-11, capturas 01, 01a y 02. El 27 oct 2026 la suite de Selenium repitió la edición y el guardado de observaciones de un examen (EXA-01 y EXA-02).</w:t>
             </w:r>
           </w:p>
         </w:tc>
@@ -25119,13 +25190,7 @@
               <w:rPr>
                 <w:sz w:val="18"/>
               </w:rPr>
-              <w:t>Evidencias/CP-12, capturas</w:t>
-            </w:r>
-            <w:r>
-              <w:rPr>
-                <w:sz w:val="18"/>
-              </w:rPr>
-              <w:t xml:space="preserve"> 01 a 03. El 27 oct 2026 la suite de Selenium confirmó que el menú del paciente muestra Mis Resultados sin Usuarios ni Auditoría (RES-01 y RBAC-03).</w:t>
+              <w:t>Evidencias/CP-12, capturas 01 a 03. El 27 oct 2026 la suite de Selenium confirmó que el menú del paciente muestra Mis Resultados sin Usuarios ni Auditoría (RES-01 y RBAC-03).</w:t>
             </w:r>
           </w:p>
         </w:tc>
@@ -25553,15 +25618,7 @@
                 <w:sz w:val="18"/>
                 <w:lang w:val="es-CL"/>
               </w:rPr>
-              <w:t xml:space="preserve">20 oct 2026. SQLMap y Postman. SQLMap no encontró parámetros inyectables y los payloads manuales tipo OR 1=1 en el login devuelven 401. 26 oct 2026. ZAP 2.17.0 con token de médico y de paciente terminó con 0 alertas altas, 2 medias y 4 bajas (reporte no exportado). </w:t>
-            </w:r>
-            <w:r>
-              <w:rPr>
-                <w:sz w:val="18"/>
-                <w:lang w:val="es-CL"/>
-              </w:rPr>
-              <w:lastRenderedPageBreak/>
-              <w:t>Con curl, la API responde CORS * y X-Powered-By: Express, sin CSP, X-Frame-Options, X-Content-Type-Options ni HSTS. Con token de paciente, las escrituras y los datos de otro paciente responden 403, y sin token 401. Burp y Nikto no se usaron.</w:t>
+              <w:t>20 oct 2026. SQLMap y Postman. SQLMap no encontró parámetros inyectables y los payloads manuales tipo OR 1=1 en el login devuelven 401. 26 oct 2026. ZAP 2.17.0 con token de médico y de paciente terminó con 0 alertas altas, 2 medias y 4 bajas (reporte no exportado). Con curl, la API responde CORS * y X-Powered-By: Express, sin CSP, X-Frame-Options, X-Content-Type-Options ni HSTS. Con token de paciente, las escrituras y los datos de otro paciente responden 403, y sin token 401. Burp y Nikto no se usaron.</w:t>
             </w:r>
           </w:p>
         </w:tc>
@@ -25581,16 +25638,7 @@
                 <w:sz w:val="18"/>
                 <w:lang w:val="es-CL"/>
               </w:rPr>
-              <w:lastRenderedPageBreak/>
-              <w:t xml:space="preserve">INC-05 confirmado en CORS y cabeceras. El límite de intentos de login no se </w:t>
-            </w:r>
-            <w:r>
-              <w:rPr>
-                <w:sz w:val="18"/>
-                <w:lang w:val="es-CL"/>
-              </w:rPr>
-              <w:lastRenderedPageBreak/>
-              <w:t>probó. INC-08 no se probó.</w:t>
+              <w:t>INC-05 confirmado en CORS y cabeceras. El límite de intentos de login no se probó. INC-08 no se probó.</w:t>
             </w:r>
           </w:p>
         </w:tc>
@@ -25610,7 +25658,6 @@
                 <w:sz w:val="18"/>
                 <w:lang w:val="es-CL"/>
               </w:rPr>
-              <w:lastRenderedPageBreak/>
               <w:t>20 y 26 oct 2026</w:t>
             </w:r>
           </w:p>
@@ -25626,15 +25673,7 @@
                 <w:sz w:val="18"/>
                 <w:lang w:val="es-CL"/>
               </w:rPr>
-              <w:t xml:space="preserve">Nicolás Barra (SQLMap). Ari </w:t>
-            </w:r>
-            <w:r>
-              <w:rPr>
-                <w:sz w:val="18"/>
-                <w:lang w:val="es-CL"/>
-              </w:rPr>
-              <w:lastRenderedPageBreak/>
-              <w:t>Araya (ZAP, cabeceras y control de acceso)</w:t>
+              <w:t>Nicolás Barra (SQLMap). Ari Araya (ZAP, cabeceras y control de acceso)</w:t>
             </w:r>
           </w:p>
         </w:tc>
@@ -25656,7 +25695,6 @@
               <w:rPr>
                 <w:sz w:val="18"/>
               </w:rPr>
-              <w:lastRenderedPageBreak/>
               <w:t>CP-07</w:t>
             </w:r>
           </w:p>
@@ -25719,13 +25757,7 @@
               <w:rPr>
                 <w:sz w:val="18"/>
               </w:rPr>
-              <w:t>Evidencias/CP-07, capturas</w:t>
-            </w:r>
-            <w:r>
-              <w:rPr>
-                <w:sz w:val="18"/>
-              </w:rPr>
-              <w:t xml:space="preserve"> 01 a 03. El 27 oct 2026 la suite de Selenium confirmó en la interfaz el regreso al login (AUTH-03). El resultado se mantiene, porque el token sigue válido en la API.</w:t>
+              <w:t>Evidencias/CP-07, capturas 01 a 03. El 27 oct 2026 la suite de Selenium confirmó en la interfaz el regreso al login (AUTH-03). El resultado se mantiene, porque el token sigue válido en la API.</w:t>
             </w:r>
           </w:p>
         </w:tc>
@@ -25978,14 +26010,7 @@
                 <w:sz w:val="18"/>
                 <w:lang w:val="es-CL"/>
               </w:rPr>
-              <w:t>Security Hotspots</w:t>
-            </w:r>
-            <w:r>
-              <w:rPr>
-                <w:sz w:val="18"/>
-                <w:lang w:val="es-CL"/>
-              </w:rPr>
-              <w:t xml:space="preserve"> ni la fuga de mensajes (sección 5.4). 26 oct 2026. Swagger y curl en lugar de Burp Suite. Los rechazos 401 y 403 devuelven mensajes genéricos y POST /documentos respondió 500 sin que se guardara el cuerpo. 27 oct 2026. Revisión del código de main con 34 bloques catch en ocho rutas que responden glosa con err.message y escriben console.error(err). El log de acceso es morgan en formato dev, sin redacción.</w:t>
+              <w:t>Security Hotspots ni la fuga de mensajes (sección 5.4). 26 oct 2026. Swagger y curl en lugar de Burp Suite. Los rechazos 401 y 403 devuelven mensajes genéricos y POST /documentos respondió 500 sin que se guardara el cuerpo. 27 oct 2026. Revisión del código de main con 34 bloques catch en ocho rutas que responden glosa con err.message y escriben console.error(err). El log de acceso es morgan en formato dev, sin redacción.</w:t>
             </w:r>
           </w:p>
         </w:tc>
@@ -26518,7 +26543,7 @@
                 <w:sz w:val="18"/>
                 <w:lang w:val="es-CL"/>
               </w:rPr>
-              <w:t>healthy, pero hay una sola réplica, reinicio unless-stopped, healthcheck sin start_period y solo HTTP en el puerto 80. No hay respaldo automático, ventana de mantenimiento ni medición del 99,5 %.</w:t>
+              <w:t>, pero hay una sola réplica, reinicio unless-stopped, healthcheck sin start_period y solo HTTP en el puerto 80. No hay respaldo automático, ventana de mantenimiento ni medición del 99,5 %.</w:t>
             </w:r>
           </w:p>
         </w:tc>
@@ -26636,15 +26661,7 @@
                 <w:sz w:val="18"/>
                 <w:lang w:val="es-CL"/>
               </w:rPr>
-              <w:t xml:space="preserve">26 oct 2026. Revisión documental con las exigencias de la Tabla 29, cruzadas con los resultados de esta tabla. No se </w:t>
-            </w:r>
-            <w:r>
-              <w:rPr>
-                <w:sz w:val="18"/>
-                <w:lang w:val="es-CL"/>
-              </w:rPr>
-              <w:lastRenderedPageBreak/>
-              <w:t>cumplen el DS 41 art. 9 (CP-03), el DS 41 art. 8 (CP-14 y CP-18) ni la Ley 20.584 art. 13 (CP-07). CP-16 deja una brecha frente a la Ley 21.719. Detalle en la sección 6.4.</w:t>
+              <w:t>26 oct 2026. Revisión documental con las exigencias de la Tabla 29, cruzadas con los resultados de esta tabla. No se cumplen el DS 41 art. 9 (CP-03), el DS 41 art. 8 (CP-14 y CP-18) ni la Ley 20.584 art. 13 (CP-07). CP-16 deja una brecha frente a la Ley 21.719. Detalle en la sección 6.4.</w:t>
             </w:r>
           </w:p>
         </w:tc>
@@ -26664,16 +26681,7 @@
                 <w:sz w:val="18"/>
                 <w:lang w:val="es-CL"/>
               </w:rPr>
-              <w:lastRenderedPageBreak/>
-              <w:t xml:space="preserve">INC-03, INC-13 e INC-14. </w:t>
-            </w:r>
-            <w:r>
-              <w:rPr>
-                <w:sz w:val="18"/>
-                <w:lang w:val="es-CL"/>
-              </w:rPr>
-              <w:lastRenderedPageBreak/>
-              <w:t>Además, CP-14 y CP-18 sin ID.</w:t>
+              <w:t>INC-03, INC-13 e INC-14. Además, CP-14 y CP-18 sin ID.</w:t>
             </w:r>
           </w:p>
         </w:tc>
@@ -26689,7 +26697,6 @@
               <w:rPr>
                 <w:sz w:val="18"/>
               </w:rPr>
-              <w:lastRenderedPageBreak/>
               <w:t>26 oct 2026</w:t>
             </w:r>
             <w:r>
@@ -26697,14 +26704,7 @@
                 <w:sz w:val="18"/>
               </w:rPr>
               <w:br/>
-              <w:t>Giannin</w:t>
-            </w:r>
-            <w:r>
-              <w:rPr>
-                <w:sz w:val="18"/>
-              </w:rPr>
-              <w:lastRenderedPageBreak/>
-              <w:t>a Guerrero</w:t>
+              <w:t>Giannina Guerrero</w:t>
             </w:r>
           </w:p>
         </w:tc>
@@ -26730,7 +26730,6 @@
                 <w:color w:val="1F3A5F"/>
                 <w:sz w:val="18"/>
               </w:rPr>
-              <w:lastRenderedPageBreak/>
               <w:t>PRUEBAS: RENDIMIENTO</w:t>
             </w:r>
           </w:p>
@@ -27378,13 +27377,7 @@
         <w:rPr>
           <w:lang w:val="es-CL"/>
         </w:rPr>
-        <w:t>Los casos de configuración, usabilidad y compatibilidad (CP-06, CP-14, CP-16, CP-18, CP-20 y CP-22) se ejecutaron el 20 de octubre de 2026. El detalle está en la Tabla 24. Los casos funcionales y de integración (CP-01 a CP-03 y CP-07 a CP-13) y la parte de SQLMap de CP-04 los ejecutó Nicolás Barra el mismo día, según su bitácora. Los casos de seguridad, rendimiento y disponibilidad (la parte dinámica de CP-04, CP-05, CP-15, CP-17 y CP-21) los ejecutó Ari Araya el 26 de octubre de 2026, y Skarlett Tropan cer</w:t>
-      </w:r>
-      <w:r>
-        <w:rPr>
-          <w:lang w:val="es-CL"/>
-        </w:rPr>
-        <w:t>ró CP-17 el 27 de octubre con la revisión del código. CP-19 no alcanzó a correrse y queda como no ejecutado al 27 de octubre de 2026. CP-23 se resolvió como revisión documental sobre estos resultados y su detalle está en la sección 6.4.</w:t>
+        <w:t>Los casos de configuración, usabilidad y compatibilidad (CP-06, CP-14, CP-16, CP-18, CP-20 y CP-22) se ejecutaron el 20 de octubre de 2026. El detalle está en la Tabla 24. Los casos funcionales y de integración (CP-01 a CP-03 y CP-07 a CP-13) y la parte de SQLMap de CP-04 los ejecutó Nicolás Barra el mismo día, según su bitácora. Los casos de seguridad, rendimiento y disponibilidad (la parte dinámica de CP-04, CP-05, CP-15, CP-17 y CP-21) los ejecutó Ari Araya el 26 de octubre de 2026, y Skarlett Tropan cerró CP-17 el 27 de octubre con la revisión del código. CP-19 no alcanzó a correrse y queda como no ejecutado al 27 de octubre de 2026. CP-23 se resolvió como revisión documental sobre estos resultados y su detalle está en la sección 6.4.</w:t>
       </w:r>
     </w:p>
     <w:p>
@@ -27399,7 +27392,6 @@
         <w:rPr>
           <w:lang w:val="es-CL"/>
         </w:rPr>
-        <w:lastRenderedPageBreak/>
         <w:t>CP-14 falla frente a NFR-SEG-1. En el contenedor del frontend, nginx escucha solo el puerto 80 y no redirige a HTTPS. docker-compose publica el frontend en 3333:80 y la API en 4444:4000, sin certificados. Ese día ambas URLs respondieron HTTP/1.1 200 y la conexión HTTPS falló. No aparece el encabezado Strict-Transport-</w:t>
       </w:r>
       <w:r>
@@ -27413,7 +27405,7 @@
         <w:rPr>
           <w:lang w:val="es-CL"/>
         </w:rPr>
-        <w:t>Security. PostgreSQL tiene ssl en off. Nikto no estaba instalado en el equipo, así que la verificación se hizo con la configuración y con curl.</w:t>
+        <w:t>. PostgreSQL tiene ssl en off. Nikto no estaba instalado en el equipo, así que la verificación se hizo con la configuración y con curl.</w:t>
       </w:r>
     </w:p>
     <w:p>
@@ -27428,13 +27420,7 @@
         <w:rPr>
           <w:lang w:val="es-CL"/>
         </w:rPr>
-        <w:t>CP-16 falla frente a NFR-SEG-3 y confirma INC-16 en la parte del archivo. La base no tiene la extensión pgcrypto. Las alergias, las enfermedades crónicas, las observaciones, el diagnóstico y la contraseña están en columnas text, y el documento del examen está en bytea</w:t>
-      </w:r>
-      <w:r>
-        <w:rPr>
-          <w:lang w:val="es-CL"/>
-        </w:rPr>
-        <w:t>, sin cifrado. Se dejó un archivo sintético en la carpeta de documentos y GET /files/documentos lo devolvió con 200 sin token. El archivo se eliminó al terminar la prueba. El hallazgo de SonarQube sobre la contraseña de PostgreSQL en el código queda en la sección 5.4.</w:t>
+        <w:t>CP-16 falla frente a NFR-SEG-3 y confirma INC-16 en la parte del archivo. La base no tiene la extensión pgcrypto. Las alergias, las enfermedades crónicas, las observaciones, el diagnóstico y la contraseña están en columnas text, y el documento del examen está en bytea, sin cifrado. Se dejó un archivo sintético en la carpeta de documentos y GET /files/documentos lo devolvió con 200 sin token. El archivo se eliminó al terminar la prueba. El hallazgo de SonarQube sobre la contraseña de PostgreSQL en el código queda en la sección 5.4.</w:t>
       </w:r>
     </w:p>
     <w:p>
@@ -27449,13 +27435,7 @@
         <w:rPr>
           <w:lang w:val="es-CL"/>
         </w:rPr>
-        <w:t>CP-18 falla frente a NFR-SEG-7 porque el despliegue no define una política de respaldo: no hay programación, retención ni copia externa. El script SQL de carga inicial solo inicializa el contenedor. Sí se pudo respaldar y restaurar: pg_dump</w:t>
-      </w:r>
-      <w:r>
-        <w:rPr>
-          <w:lang w:val="es-CL"/>
-        </w:rPr>
-        <w:t xml:space="preserve"> de la base en ejecución se cargó en una base temporal y los conteos coincidieron (3 usuarios, 20 pacientes, 0 exámenes, 0 documentos, 6 registros de auditoría y 3 roles). Esa base temporal y el volcado se eliminaron después de la comparación.</w:t>
+        <w:t>CP-18 falla frente a NFR-SEG-7 porque el despliegue no define una política de respaldo: no hay programación, retención ni copia externa. El script SQL de carga inicial solo inicializa el contenedor. Sí se pudo respaldar y restaurar: pg_dump de la base en ejecución se cargó en una base temporal y los conteos coincidieron (3 usuarios, 20 pacientes, 0 exámenes, 0 documentos, 6 registros de auditoría y 3 roles). Esa base temporal y el volcado se eliminaron después de la comparación.</w:t>
       </w:r>
     </w:p>
     <w:p>
@@ -27470,19 +27450,7 @@
         <w:rPr>
           <w:lang w:val="es-CL"/>
         </w:rPr>
-        <w:t>CP-06 falla frente a NFR-USAB-1, NFR-USAB-4 y NFR-COMPAT-2. Lighthouse, en la página de login, dio accesibilidad 0,96 y marcó contraste insuficiente en los controles Entrar, Regístrate y Guía inicial. Medido en pantalla, el texto blanco del botón queda en 3,98:1 y el mensaje de error en 3,76:1, bajo el 4,5:1 de texto normal. Las etiquetas miden 12,25 px y los campos 14 px, pequeños para una persona mayor. En una ventana de 390 px</w:t>
-      </w:r>
-      <w:r>
-        <w:rPr>
-          <w:lang w:val="es-CL"/>
-        </w:rPr>
-        <w:t xml:space="preserve"> el panel de login sigue al 50 % del ancho, el título se parte en dos líneas y la fotografía ocupa la otra mitad. El menú interno sí tiene versión móvil. El médico ve Pacientes y Exámenes al mismo nivel, sin un paso que obligue a abrir al paciente antes del examen. INC-12 no se reejecutó</w:t>
-      </w:r>
-      <w:r>
-        <w:rPr>
-          <w:lang w:val="es-CL"/>
-        </w:rPr>
-        <w:t>: hay 0 exámenes y 0 documentos, y el código actual descarga el archivo en lugar de abrir un selector. No se hizo la prueba de usabilidad con cinco usuarios que pide el ERS (§3.1.1), por lo que este resultado se apoya en Lighthouse y en la medición directa.</w:t>
+        <w:t>CP-06 falla frente a NFR-USAB-1, NFR-USAB-4 y NFR-COMPAT-2. Lighthouse, en la página de login, dio accesibilidad 0,96 y marcó contraste insuficiente en los controles Entrar, Regístrate y Guía inicial. Medido en pantalla, el texto blanco del botón queda en 3,98:1 y el mensaje de error en 3,76:1, bajo el 4,5:1 de texto normal. Las etiquetas miden 12,25 px y los campos 14 px, pequeños para una persona mayor. En una ventana de 390 px el panel de login sigue al 50 % del ancho, el título se parte en dos líneas y la fotografía ocupa la otra mitad. El menú interno sí tiene versión móvil. El médico ve Pacientes y Exámenes al mismo nivel, sin un paso que obligue a abrir al paciente antes del examen. INC-12 no se reejecutó: hay 0 exámenes y 0 documentos, y el código actual descarga el archivo en lugar de abrir un selector. No se hizo la prueba de usabilidad con cinco usuarios que pide el ERS (§3.1.1), por lo que este resultado se apoya en Lighthouse y en la medición directa.</w:t>
       </w:r>
     </w:p>
     <w:p>
@@ -27497,14 +27465,7 @@
         <w:rPr>
           <w:lang w:val="es-CL"/>
         </w:rPr>
-        <w:t xml:space="preserve">CP-20 falla frente a NFR-USAB-3. Los errores de formulario sí se entienden: al enviar el login vacío aparecen «El nombre de usuario es requerido» y «La contraseña es requerida», y una credencial incorrecta responde «Credenciales inválidas» (HTTP 401). La ayuda no está junto a los campos clínicos: en el login hay un diálogo de guía inicial y, ya con sesión, </w:t>
-      </w:r>
-      <w:r>
-        <w:rPr>
-          <w:lang w:val="es-CL"/>
-        </w:rPr>
-        <w:lastRenderedPageBreak/>
-        <w:t>una página /ayuda. INC-06 no se reprodujo en este recorrido de login. El mensaje interno sí queda confirmado en el código y se registra en CP-17.</w:t>
+        <w:t>CP-20 falla frente a NFR-USAB-3. Los errores de formulario sí se entienden: al enviar el login vacío aparecen «El nombre de usuario es requerido» y «La contraseña es requerida», y una credencial incorrecta responde «Credenciales inválidas» (HTTP 401). La ayuda no está junto a los campos clínicos: en el login hay un diálogo de guía inicial y, ya con sesión, una página /ayuda. INC-06 no se reprodujo en este recorrido de login. El mensaje interno sí queda confirmado en el código y se registra en CP-17.</w:t>
       </w:r>
     </w:p>
     <w:p>
@@ -27630,7 +27591,6 @@
           <w:sz w:val="20"/>
           <w:lang w:val="es-CL"/>
         </w:rPr>
-        <w:lastRenderedPageBreak/>
         <w:t xml:space="preserve">Figura 2. </w:t>
       </w:r>
       <w:r>
@@ -27724,7 +27684,6 @@
           <w:sz w:val="20"/>
           <w:lang w:val="es-CL"/>
         </w:rPr>
-        <w:lastRenderedPageBreak/>
         <w:t xml:space="preserve">Figura 3. </w:t>
       </w:r>
       <w:r>
@@ -27815,13 +27774,7 @@
         <w:rPr>
           <w:lang w:val="es-CL"/>
         </w:rPr>
-        <w:t>CP-04 queda parcial. El 26 de octubre Ari Araya corrió OWASP ZAP 2.17.0 con sesión, importando la definición OpenAPI de la API y agregando el token de médico y después el de paciente en cada petición. El escaneo terminó con 0 alertas altas, 2 medias y 4 bajas. El reporte no se exportó, así que el detalle de esas alertas no queda en la evidencia. Durante el escaneo, POST /documentos respondió 500 con los dos tokens. Nikto no se usó y las cabeceras se revisaron con curl. La API responde Access-Control-Allow-O</w:t>
-      </w:r>
-      <w:r>
-        <w:rPr>
-          <w:lang w:val="es-CL"/>
-        </w:rPr>
-        <w:t>rigin con asterisco y X-Powered-By: Express, y no envía CSP, X-Frame-Options, X-Content-Type-Options ni HSTS. Con eso INC-05 queda confirmado en CORS y cabeceras. El límite de intentos de login no se probó.</w:t>
+        <w:t>CP-04 queda parcial. El 26 de octubre Ari Araya corrió OWASP ZAP 2.17.0 con sesión, importando la definición OpenAPI de la API y agregando el token de médico y después el de paciente en cada petición. El escaneo terminó con 0 alertas altas, 2 medias y 4 bajas. El reporte no se exportó, así que el detalle de esas alertas no queda en la evidencia. Durante el escaneo, POST /documentos respondió 500 con los dos tokens. Nikto no se usó y las cabeceras se revisaron con curl. La API responde Access-Control-Allow-Origin con asterisco y X-Powered-By: Express, y no envía CSP, X-Frame-Options, X-Content-Type-Options ni HSTS. Con eso INC-05 queda confirmado en CORS y cabeceras. El límite de intentos de login no se probó.</w:t>
       </w:r>
     </w:p>
     <w:p>
@@ -27836,14 +27789,7 @@
         <w:rPr>
           <w:lang w:val="es-CL"/>
         </w:rPr>
-        <w:lastRenderedPageBreak/>
-        <w:t>Burp Suite tampoco se usó. El control de acceso se probó con Swagger y curl, cambiando el token y el identificador en cada petición. Con token de paciente, GET /pacientes/2, DELETE /pacientes/1, DELETE /examenes/10 y POST /examenes con un cuerpo válido responden 403. El paciente 1 recibe 200 al pedir sus propios exámenes y 403 al pedir los del paciente 2, mientras que el médico recibe 200. Sin token la respuesta es 401 «Token inválido». Esta parte cumple RB-1, aunque la prueba no llamó a /roles, así que INC</w:t>
-      </w:r>
-      <w:r>
-        <w:rPr>
-          <w:lang w:val="es-CL"/>
-        </w:rPr>
-        <w:t>-07 sigue sin ejecutarse. Si el cuerpo de la petición es inválido, la API responde 400 antes de revisar el rol, porque la validación corre primero.</w:t>
+        <w:t>Burp Suite tampoco se usó. El control de acceso se probó con Swagger y curl, cambiando el token y el identificador en cada petición. Con token de paciente, GET /pacientes/2, DELETE /pacientes/1, DELETE /examenes/10 y POST /examenes con un cuerpo válido responden 403. El paciente 1 recibe 200 al pedir sus propios exámenes y 403 al pedir los del paciente 2, mientras que el médico recibe 200. Sin token la respuesta es 401 «Token inválido». Esta parte cumple RB-1, aunque la prueba no llamó a /roles, así que INC-07 sigue sin ejecutarse. Si el cuerpo de la petición es inválido, la API responde 400 antes de revisar el rol, porque la validación corre primero.</w:t>
       </w:r>
     </w:p>
     <w:p>
@@ -27969,7 +27915,6 @@
           <w:sz w:val="20"/>
           <w:lang w:val="es-CL"/>
         </w:rPr>
-        <w:lastRenderedPageBreak/>
         <w:t xml:space="preserve">Figura 5. </w:t>
       </w:r>
       <w:r>
@@ -28073,19 +28018,7 @@
         <w:rPr>
           <w:lang w:val="es-CL"/>
         </w:rPr>
-        <w:t>Security Hotspots</w:t>
-      </w:r>
-      <w:r>
-        <w:rPr>
-          <w:lang w:val="es-CL"/>
-        </w:rPr>
-        <w:t xml:space="preserve"> ni detectó los mensajes internos que el backend devuelve al cliente, y el detalle del escáner está en la sección 5.4. El 27 de octubre Skarlett Tropan revisó el código de main y encontró el mismo patrón en 34 bloques catch de ocho rutas. Cada uno escribe el error completo con console.error y le responde al cliente un campo glosa con err.message. El log de acceso usa morgan en formato dev, sin redacción. Con eso INC-06 queda confirmado en el código, aunque falta la captura del cuerpo de un 500, porque el qu</w:t>
-      </w:r>
-      <w:r>
-        <w:rPr>
-          <w:lang w:val="es-CL"/>
-        </w:rPr>
-        <w:t>e apareció el 26 de octubre en POST /documentos no se guardó. Ese mismo día Ari Araya probó con Swagger y curl la parte que el plan le asignaba a Burp Suite, y los 401 y 403 usaron mensajes genéricos. INC-14 ya estaba confirmado en CP-03, donde un médico escribió en la auditoría con POST /auditoria y recibió 201. INC-11 sigue sin ejecutar al 27 de octubre de 2026, porque no se corrió npm audit.</w:t>
+        <w:t>Security Hotspots ni detectó los mensajes internos que el backend devuelve al cliente, y el detalle del escáner está en la sección 5.4. El 27 de octubre Skarlett Tropan revisó el código de main y encontró el mismo patrón en 34 bloques catch de ocho rutas. Cada uno escribe el error completo con console.error y le responde al cliente un campo glosa con err.message. El log de acceso usa morgan en formato dev, sin redacción. Con eso INC-06 queda confirmado en el código, aunque falta la captura del cuerpo de un 500, porque el que apareció el 26 de octubre en POST /documentos no se guardó. Ese mismo día Ari Araya probó con Swagger y curl la parte que el plan le asignaba a Burp Suite, y los 401 y 403 usaron mensajes genéricos. INC-14 ya estaba confirmado en CP-03, donde un médico escribió en la auditoría con POST /auditoria y recibió 201. INC-11 sigue sin ejecutar al 27 de octubre de 2026, porque no se corrió npm audit.</w:t>
       </w:r>
     </w:p>
     <w:p>
@@ -28100,13 +28033,7 @@
         <w:rPr>
           <w:lang w:val="es-CL"/>
         </w:rPr>
-        <w:t>CP-05 falla y confirma INC-04. Con el plan de JMeter de la EV1 y el retraso activo, 70 usuarios virtuales generaron 220 muestras en 59 segundos, con 3,7 peticiones por segundo, promedio de 2965 ms, máximo de 5016 ms y 0 % de error. El login responde en unos 13 ms, mientras que las consultas de pacientes y exámenes promedian entre 5008 y 5011 ms, muy lejos de los 300 ms que pide el ERS. La corrida sin el retraso no se hizo, así que el tiempo real del CRUD sigue sin medirse. CP-19 tampoco se ejecutó, por lo q</w:t>
-      </w:r>
-      <w:r>
-        <w:rPr>
-          <w:lang w:val="es-CL"/>
-        </w:rPr>
-        <w:t>ue no hay medición de Lighthouse sobre la página principal ni prueba con 200 usuarios.</w:t>
+        <w:t>CP-05 falla y confirma INC-04. Con el plan de JMeter de la EV1 y el retraso activo, 70 usuarios virtuales generaron 220 muestras en 59 segundos, con 3,7 peticiones por segundo, promedio de 2965 ms, máximo de 5016 ms y 0 % de error. El login responde en unos 13 ms, mientras que las consultas de pacientes y exámenes promedian entre 5008 y 5011 ms, muy lejos de los 300 ms que pide el ERS. La corrida sin el retraso no se hizo, así que el tiempo real del CRUD sigue sin medirse. CP-19 tampoco se ejecutó, por lo que no hay medición de Lighthouse sobre la página principal ni prueba con 200 usuarios.</w:t>
       </w:r>
     </w:p>
     <w:p>
@@ -28124,7 +28051,6 @@
           <w:sz w:val="20"/>
           <w:lang w:val="es-CL"/>
         </w:rPr>
-        <w:lastRenderedPageBreak/>
         <w:t xml:space="preserve">Figura 6. </w:t>
       </w:r>
       <w:r>
@@ -28228,12 +28154,6 @@
         <w:rPr>
           <w:lang w:val="es-CL"/>
         </w:rPr>
-        <w:t>healthy</w:t>
-      </w:r>
-      <w:r>
-        <w:rPr>
-          <w:lang w:val="es-CL"/>
-        </w:rPr>
         <w:t>, pero cada servicio tiene una sola réplica, reinicio unless-stopped, un healthcheck sin start_period y solo HTTP en el puerto 80. No hay respaldo automático, ventana de mantenimiento ni una medición que permita demostrar el 99,5 % mensual. Se registra como INC-17, moderado, porque NFR-DIS-1 y NFR-DIS-2 no se pueden demostrar con este despliegue.</w:t>
       </w:r>
     </w:p>
@@ -28769,7 +28689,6 @@
           <w:color w:val="1F3A5F"/>
           <w:sz w:val="20"/>
         </w:rPr>
-        <w:lastRenderedPageBreak/>
         <w:t>Tabla 26. Incidentes y criticidad</w:t>
       </w:r>
     </w:p>
@@ -30306,7 +30225,6 @@
               <w:rPr>
                 <w:sz w:val="18"/>
               </w:rPr>
-              <w:lastRenderedPageBreak/>
               <w:t>INC-14</w:t>
             </w:r>
           </w:p>
@@ -30653,19 +30571,7 @@
         <w:rPr>
           <w:lang w:val="es-CL"/>
         </w:rPr>
-        <w:t>Con la evidencia del 26 de octubre, INC-01 se mantiene como crítico, INC-04 como grave e INC-05 como moderado, y se agrega INC-17, moderado, por la disponibilidad que CP-21 no puede demostrar. En la revisión cruzada del 27 de octubre se subieron tres severidades respecto de la primera clasificación, y se adoptaron porque cada una tiene evidencia. INC-14 pasa de moderado a grave, porque CP-03 mostró que un médico puede escribir registros en la auditoría que el DS 41 art. 9 exige conservar. INC-16 pasa de mod</w:t>
-      </w:r>
-      <w:r>
-        <w:rPr>
-          <w:lang w:val="es-CL"/>
-        </w:rPr>
-        <w:t>erado a grave, porque en CP-16 un archivo de prueba se descargó por /files/documentos sin token. INC-15 pasa de leve a moderado, porque el ERS pide DOC y PPT y CP-13 mostró que esos archivos no entran. La misma revisión precisó dos descripciones sin cambiar su severidad. INC-07 no pide token en ninguna operación de /roles, y el DELETE de usuarios de INC-09 borra antes de leer el token. La clasificación queda en 1 crítico, 9 graves y 7 moderados, sin incidentes leves. No se asignó un identificador BUG aparte</w:t>
-      </w:r>
-      <w:r>
-        <w:rPr>
-          <w:lang w:val="es-CL"/>
-        </w:rPr>
-        <w:t>, porque cada falla queda asociada a su incidente y a su caso.</w:t>
+        <w:t>Con la evidencia del 26 de octubre, INC-01 se mantiene como crítico, INC-04 como grave e INC-05 como moderado, y se agrega INC-17, moderado, por la disponibilidad que CP-21 no puede demostrar. En la revisión cruzada del 27 de octubre se subieron tres severidades respecto de la primera clasificación, y se adoptaron porque cada una tiene evidencia. INC-14 pasa de moderado a grave, porque CP-03 mostró que un médico puede escribir registros en la auditoría que el DS 41 art. 9 exige conservar. INC-16 pasa de moderado a grave, porque en CP-16 un archivo de prueba se descargó por /files/documentos sin token. INC-15 pasa de leve a moderado, porque el ERS pide DOC y PPT y CP-13 mostró que esos archivos no entran. La misma revisión precisó dos descripciones sin cambiar su severidad. INC-07 no pide token en ninguna operación de /roles, y el DELETE de usuarios de INC-09 borra antes de leer el token. La clasificación queda en 1 crítico, 9 graves y 7 moderados, sin incidentes leves. No se asignó un identificador BUG aparte, porque cada falla queda asociada a su incidente y a su caso.</w:t>
       </w:r>
     </w:p>
     <w:p>
@@ -30851,12 +30757,6 @@
               </w:rPr>
               <w:t>Passed</w:t>
             </w:r>
-            <w:r>
-              <w:rPr>
-                <w:sz w:val="20"/>
-              </w:rPr>
-              <w:t>Passed</w:t>
-            </w:r>
           </w:p>
         </w:tc>
         <w:tc>
@@ -30870,12 +30770,6 @@
             <w:r>
               <w:rPr>
                 <w:i/>
-                <w:sz w:val="20"/>
-              </w:rPr>
-              <w:t>Passed</w:t>
-            </w:r>
-            <w:r>
-              <w:rPr>
                 <w:sz w:val="20"/>
               </w:rPr>
               <w:t>Passed</w:t>
@@ -31083,7 +30977,6 @@
               <w:rPr>
                 <w:sz w:val="20"/>
               </w:rPr>
-              <w:lastRenderedPageBreak/>
               <w:t>Code Smells</w:t>
             </w:r>
           </w:p>
@@ -31263,12 +31156,6 @@
       <w:r>
         <w:rPr>
           <w:i/>
-          <w:lang w:val="es-CL"/>
-        </w:rPr>
-        <w:t>Passed</w:t>
-      </w:r>
-      <w:r>
-        <w:rPr>
           <w:lang w:val="es-CL"/>
         </w:rPr>
         <w:t>Passed</w:t>
@@ -31305,7 +31192,7 @@
         <w:rPr>
           <w:lang w:val="es-CL"/>
         </w:rPr>
-        <w:t xml:space="preserve">Summary agrupa por cualidad del software: </w:t>
+        <w:t xml:space="preserve"> agrupa por cualidad del software: </w:t>
       </w:r>
       <w:r>
         <w:rPr>
@@ -31318,7 +31205,7 @@
         <w:rPr>
           <w:lang w:val="es-CL"/>
         </w:rPr>
-        <w:t xml:space="preserve">Security, </w:t>
+        <w:t xml:space="preserve">, </w:t>
       </w:r>
       <w:r>
         <w:rPr>
@@ -31331,7 +31218,7 @@
         <w:rPr>
           <w:lang w:val="es-CL"/>
         </w:rPr>
-        <w:t xml:space="preserve">Reliability y </w:t>
+        <w:t xml:space="preserve"> y </w:t>
       </w:r>
       <w:r>
         <w:rPr>
@@ -31344,7 +31231,7 @@
         <w:rPr>
           <w:lang w:val="es-CL"/>
         </w:rPr>
-        <w:t xml:space="preserve">Maintainability. La Tabla 27 conserva los tipos clásicos que entrega el análisis. En el backend hay 4 vulnerabilidades y 2 code smells; en la captura, </w:t>
+        <w:t xml:space="preserve">. La Tabla 27 conserva los tipos clásicos que entrega el análisis. En el backend hay 4 vulnerabilidades y 2 code smells; en la captura, </w:t>
       </w:r>
       <w:r>
         <w:rPr>
@@ -31357,7 +31244,7 @@
         <w:rPr>
           <w:lang w:val="es-CL"/>
         </w:rPr>
-        <w:t xml:space="preserve">Security muestra esos 4 y </w:t>
+        <w:t xml:space="preserve"> muestra esos 4 y </w:t>
       </w:r>
       <w:r>
         <w:rPr>
@@ -31370,7 +31257,7 @@
         <w:rPr>
           <w:lang w:val="es-CL"/>
         </w:rPr>
-        <w:t xml:space="preserve">Reliability y </w:t>
+        <w:t xml:space="preserve"> y </w:t>
       </w:r>
       <w:r>
         <w:rPr>
@@ -31383,7 +31270,7 @@
         <w:rPr>
           <w:lang w:val="es-CL"/>
         </w:rPr>
-        <w:t xml:space="preserve">Maintainability muestran los mismos 2 code smells. En el frontend hay 14 bugs y 3 code smells, 17 </w:t>
+        <w:t xml:space="preserve"> muestran los mismos 2 code smells. En el frontend hay 14 bugs y 3 code smells, 17 </w:t>
       </w:r>
       <w:r>
         <w:rPr>
@@ -31396,7 +31283,7 @@
         <w:rPr>
           <w:lang w:val="es-CL"/>
         </w:rPr>
-        <w:t xml:space="preserve">issues en total; la captura los reúne en </w:t>
+        <w:t xml:space="preserve"> en total; la captura los reúne en </w:t>
       </w:r>
       <w:r>
         <w:rPr>
@@ -31409,7 +31296,7 @@
         <w:rPr>
           <w:lang w:val="es-CL"/>
         </w:rPr>
-        <w:t xml:space="preserve">Reliability (17) y vuelve a contar los 3 smells en </w:t>
+        <w:t xml:space="preserve"> (17) y vuelve a contar los 3 smells en </w:t>
       </w:r>
       <w:r>
         <w:rPr>
@@ -31422,7 +31309,7 @@
         <w:rPr>
           <w:lang w:val="es-CL"/>
         </w:rPr>
-        <w:t>Maintainability. Community Build no analiza inyección SQL ni XSS, y esta ejecución omitió el análisis de dependencias. La cobertura 0,0 % corresponde a la ausencia de pruebas unitarias en el repositorio.</w:t>
+        <w:t>. Community Build no analiza inyección SQL ni XSS, y esta ejecución omitió el análisis de dependencias. La cobertura 0,0 % corresponde a la ausencia de pruebas unitarias en el repositorio.</w:t>
       </w:r>
     </w:p>
     <w:p>
@@ -31440,7 +31327,6 @@
           <w:sz w:val="20"/>
           <w:lang w:val="es-CL"/>
         </w:rPr>
-        <w:lastRenderedPageBreak/>
         <w:t xml:space="preserve">Figura 7. </w:t>
       </w:r>
       <w:r>
@@ -31455,14 +31341,6 @@
         <w:rPr>
           <w:b/>
           <w:i/>
-          <w:sz w:val="20"/>
-          <w:lang w:val="es-CL"/>
-        </w:rPr>
-        <w:t>Summary</w:t>
-      </w:r>
-      <w:r>
-        <w:rPr>
-          <w:b/>
           <w:sz w:val="20"/>
           <w:lang w:val="es-CL"/>
         </w:rPr>
@@ -31568,7 +31446,6 @@
           <w:sz w:val="20"/>
           <w:lang w:val="es-CL"/>
         </w:rPr>
-        <w:lastRenderedPageBreak/>
         <w:t xml:space="preserve">Figura 8. </w:t>
       </w:r>
       <w:r>
@@ -31583,14 +31460,6 @@
         <w:rPr>
           <w:b/>
           <w:i/>
-          <w:sz w:val="20"/>
-          <w:lang w:val="es-CL"/>
-        </w:rPr>
-        <w:t>Summary</w:t>
-      </w:r>
-      <w:r>
-        <w:rPr>
-          <w:b/>
           <w:sz w:val="20"/>
           <w:lang w:val="es-CL"/>
         </w:rPr>
@@ -32306,7 +32175,6 @@
       <w:r>
         <w:rPr>
           <w:i/>
-          <w:color w:val="7A4B00"/>
           <w:lang w:val="es-CL"/>
         </w:rPr>
         <w:t>issues</w:t>
@@ -32316,27 +32184,11 @@
           <w:color w:val="7A4B00"/>
           <w:lang w:val="es-CL"/>
         </w:rPr>
-        <w:t>issues</w:t>
+        <w:t xml:space="preserve"> que el escáner marcó el 20 de octubre de 2026. El secreto «inseguro» de JWT, repetido en siete rutas como valor por defecto, no fue marcado. Sí se marcó un secreto del mismo tipo: la contraseña de PostgreSQL escrita en el módulo de conexión a la base, con severidad </w:t>
       </w:r>
       <w:r>
         <w:rPr>
-          <w:color w:val="7A4B00"/>
-          <w:lang w:val="es-CL"/>
-        </w:rPr>
-        <w:t xml:space="preserve"> que el escáner marcó el 20 de octubre de 2026. El secreto «inseguro» de JWT, repetido en siete rutas como valor por defecto, no fue marcado. Sí se marcó un secreto del mismo tipo: la contraseña de PostgreSQL escrita en el </w:t>
-      </w:r>
-      <w:r>
-        <w:rPr>
-          <w:color w:val="7A4B00"/>
-          <w:lang w:val="es-CL"/>
-        </w:rPr>
-        <w:lastRenderedPageBreak/>
-        <w:t xml:space="preserve">módulo de conexión a la base, con severidad </w:t>
-      </w:r>
-      <w:r>
-        <w:rPr>
           <w:i/>
-          <w:color w:val="7A4B00"/>
           <w:lang w:val="es-CL"/>
         </w:rPr>
         <w:t>Blocker</w:t>
@@ -32346,14 +32198,7 @@
           <w:color w:val="7A4B00"/>
           <w:lang w:val="es-CL"/>
         </w:rPr>
-        <w:t xml:space="preserve">Blocker. Se lee con la Ley 19.628 art. 11 y el DS 41 art. 9. La comparación de contraseña en texto plano del login (Tabla 28) no fue detectada; sigue abierta como INC-01 por la revisión manual del código. Los </w:t>
-      </w:r>
-      <w:r>
-        <w:rPr>
-          <w:color w:val="7A4B00"/>
-          <w:lang w:val="es-CL"/>
-        </w:rPr>
-        <w:t>mensajes de error internos enviados al cliente tampoco fueron detectados. El CORS permisivo de la configuración de la API (Tabla 28) quedó confirmado (</w:t>
+        <w:t>. Se lee con la Ley 19.628 art. 11 y el DS 41 art. 9. La comparación de contraseña en texto plano del login (Tabla 28) no fue detectada; sigue abierta como INC-01 por la revisión manual del código. Los mensajes de error internos enviados al cliente tampoco fueron detectados. El CORS permisivo de la configuración de la API (Tabla 28) quedó confirmado (</w:t>
       </w:r>
       <w:r>
         <w:rPr>
@@ -32365,13 +32210,6 @@
       </w:r>
       <w:r>
         <w:rPr>
-          <w:color w:val="7A4B00"/>
-          <w:lang w:val="es-CL"/>
-        </w:rPr>
-        <w:t>Security</w:t>
-      </w:r>
-      <w:r>
-        <w:rPr>
           <w:i/>
           <w:color w:val="7A4B00"/>
           <w:lang w:val="es-CL"/>
@@ -32383,14 +32221,20 @@
           <w:color w:val="7A4B00"/>
           <w:lang w:val="es-CL"/>
         </w:rPr>
-        <w:t>, Medium) y se mantiene la lectura del DS 41 art. 8. El token guardado en localStorage por el contexto de autenticación del frontend no fue marcado: el frontend</w:t>
+        <w:t xml:space="preserve">, </w:t>
       </w:r>
       <w:r>
         <w:rPr>
+          <w:lang w:val="es-CL"/>
+        </w:rPr>
+        <w:t>Medium</w:t>
+      </w:r>
+      <w:r>
+        <w:rPr>
           <w:color w:val="7A4B00"/>
           <w:lang w:val="es-CL"/>
         </w:rPr>
-        <w:t xml:space="preserve"> cerró con 0 vulnerabilidades, y el hallazgo se sostiene por la lectura del código. Las dependencias vulnerables no se evaluaron, porque el escáner informó que el análisis de dependencias fue omitido.</w:t>
+        <w:t>) y se mantiene la lectura del DS 41 art. 8. El token guardado en localStorage por el contexto de autenticación del frontend no fue marcado: el frontend cerró con 0 vulnerabilidades, y el hallazgo se sostiene por la lectura del código. Las dependencias vulnerables no se evaluaron, porque el escáner informó que el análisis de dependencias fue omitido.</w:t>
       </w:r>
     </w:p>
     <w:p>
@@ -32418,7 +32262,7 @@
         <w:rPr>
           <w:lang w:val="es-CL"/>
         </w:rPr>
-        <w:t>issues. En el frontend el ancho del panel recorta el final de algunos títulos largos; en cada tarjeta se leen el archivo y la severidad, y la última figura cierra el listado en 17 de 17.</w:t>
+        <w:t>. En el frontend el ancho del panel recorta el final de algunos títulos largos; en cada tarjeta se leen el archivo y la severidad, y la última figura cierra el listado en 17 de 17.</w:t>
       </w:r>
     </w:p>
     <w:p>
@@ -32529,7 +32373,6 @@
           <w:sz w:val="20"/>
           <w:lang w:val="es-CL"/>
         </w:rPr>
-        <w:lastRenderedPageBreak/>
         <w:t xml:space="preserve">Figura 10. </w:t>
       </w:r>
       <w:r>
@@ -32716,7 +32559,6 @@
           <w:sz w:val="20"/>
           <w:lang w:val="es-CL"/>
         </w:rPr>
-        <w:lastRenderedPageBreak/>
         <w:t xml:space="preserve">Figura 12. </w:t>
       </w:r>
       <w:r>
@@ -32903,7 +32745,6 @@
           <w:sz w:val="20"/>
           <w:lang w:val="es-CL"/>
         </w:rPr>
-        <w:lastRenderedPageBreak/>
         <w:t xml:space="preserve">Figura 14. </w:t>
       </w:r>
       <w:r>
@@ -33090,7 +32931,6 @@
           <w:sz w:val="20"/>
           <w:lang w:val="es-CL"/>
         </w:rPr>
-        <w:lastRenderedPageBreak/>
         <w:t xml:space="preserve">Figura 16. </w:t>
       </w:r>
       <w:r>
@@ -33236,13 +33076,7 @@
         <w:rPr>
           <w:lang w:val="es-CL"/>
         </w:rPr>
-        <w:t>La mayoría de estas leyes no obligan al software, sino a quien lo usa para tratar datos o atender pacientes, que en este caso es el centro de salud que opere Cuidarte+. CreaLab</w:t>
-      </w:r>
-      <w:r>
-        <w:rPr>
-          <w:lang w:val="es-CL"/>
-        </w:rPr>
-        <w:t>, como desarrollador, queda obligado de forma indirecta: si entrega un sistema que no permite cumplir la ley, el prestador tampoco podrá cumplirla. Por eso cada norma termina en una exigencia que se puede verificar con un caso de la matriz.</w:t>
+        <w:t>La mayoría de estas leyes no obligan al software, sino a quien lo usa para tratar datos o atender pacientes, que en este caso es el centro de salud que opere Cuidarte+. CreaLab, como desarrollador, queda obligado de forma indirecta: si entrega un sistema que no permite cumplir la ley, el prestador tampoco podrá cumplirla. Por eso cada norma termina en una exigencia que se puede verificar con un caso de la matriz.</w:t>
       </w:r>
     </w:p>
     <w:p>
@@ -33288,7 +33122,6 @@
           <w:sz w:val="20"/>
           <w:lang w:val="es-CL"/>
         </w:rPr>
-        <w:lastRenderedPageBreak/>
         <w:t xml:space="preserve">Tabla 29. </w:t>
       </w:r>
       <w:r>
@@ -33827,14 +33660,7 @@
                 <w:sz w:val="18"/>
                 <w:lang w:val="es-CL"/>
               </w:rPr>
-              <w:t>Nuevo texto de la Ley 19.628: art. 3 (principios); art. 14 quinquies (medidas de seguridad); art. 14 sexies</w:t>
-            </w:r>
-            <w:r>
-              <w:rPr>
-                <w:sz w:val="18"/>
-                <w:lang w:val="es-CL"/>
-              </w:rPr>
-              <w:t xml:space="preserve"> (reporte de vulneraciones); art. 16 bis (datos de salud); arts. </w:t>
+              <w:t xml:space="preserve">Nuevo texto de la Ley 19.628: art. 3 (principios); art. 14 quinquies (medidas de seguridad); art. 14 sexies (reporte de vulneraciones); art. 16 bis (datos de salud); arts. </w:t>
             </w:r>
             <w:r>
               <w:rPr>
@@ -34291,7 +34117,6 @@
         <w:rPr>
           <w:lang w:val="es-CL"/>
         </w:rPr>
-        <w:lastRenderedPageBreak/>
         <w:t>El Código Sanitario figuraba en la EV1 como texto suelto, sin artículos y con referencias a farmacias y sustancias que no corresponden al caso, por lo que se retiró. La Ley 19.799 y el Decreto 181 solo aplican si los informes se firman electrónicamente, lo que el ERS no pide, y la Ley 21.180 solo si el sistema interopera con organismos públicos.</w:t>
       </w:r>
     </w:p>
@@ -34320,13 +34145,7 @@
         <w:rPr>
           <w:lang w:val="es-CL"/>
         </w:rPr>
-        <w:t>Al cruzar el ERS con la Ley 20.584 encontramos un punto que no vimos en la EV1. La regla RB-3 dice que un médico puede ver la información clínica de cualquier paciente registrado. El artículo 13 de la Ley 20.584 dispone que quienes no estén directamente relacionados con la atención no tendrán acceso a la ficha, incluido el personal de salud del mismo prestador que no participa en esa atención, y el artículo 9 del DS 41 agrega que el acceso debe ser controlado y registrado. RB-2 tiene un problema parecido, p</w:t>
-      </w:r>
-      <w:r>
-        <w:rPr>
-          <w:lang w:val="es-CL"/>
-        </w:rPr>
-        <w:t>orque entrega acceso completo a un administrador que no participa en la atención.</w:t>
+        <w:t>Al cruzar el ERS con la Ley 20.584 encontramos un punto que no vimos en la EV1. La regla RB-3 dice que un médico puede ver la información clínica de cualquier paciente registrado. El artículo 13 de la Ley 20.584 dispone que quienes no estén directamente relacionados con la atención no tendrán acceso a la ficha, incluido el personal de salud del mismo prestador que no participa en esa atención, y el artículo 9 del DS 41 agrega que el acceso debe ser controlado y registrado. RB-2 tiene un problema parecido, porque entrega acceso completo a un administrador que no participa en la atención.</w:t>
       </w:r>
     </w:p>
     <w:p>
@@ -35129,7 +34948,6 @@
               <w:rPr>
                 <w:sz w:val="20"/>
               </w:rPr>
-              <w:lastRenderedPageBreak/>
               <w:t>INC-05, 06, 08, 10, 12, 15</w:t>
             </w:r>
           </w:p>
@@ -35373,13 +35191,7 @@
         <w:rPr>
           <w:lang w:val="es-CL"/>
         </w:rPr>
-        <w:t>Sobre INC-09 tomamos una decisión distinta a la de la EV1. El borrado físico no bloquea el uso del sistema, pero una ficha clínica eliminada sin acta antes de 15 años no se puede recuperar y deja al prestador fuera de los artículos 11 y 12 del DS 41; por eso lo clasificamos como grave. También informamos los controles que sí funcionan: el login usa consultas parametrizadas, /usuarios rechaza con 403 a un paciente, la API le rechaza con 403 las escrituras y los datos de otros pacientes, la descarga limita al</w:t>
-      </w:r>
-      <w:r>
-        <w:rPr>
-          <w:lang w:val="es-CL"/>
-        </w:rPr>
-        <w:t xml:space="preserve"> paciente a sus propios documentos y la carga de archivos limita el tamaño a 10 MB.</w:t>
+        <w:t>Sobre INC-09 tomamos una decisión distinta a la de la EV1. El borrado físico no bloquea el uso del sistema, pero una ficha clínica eliminada sin acta antes de 15 años no se puede recuperar y deja al prestador fuera de los artículos 11 y 12 del DS 41; por eso lo clasificamos como grave. También informamos los controles que sí funcionan: el login usa consultas parametrizadas, /usuarios rechaza con 403 a un paciente, la API le rechaza con 403 las escrituras y los datos de otros pacientes, la descarga limita al paciente a sus propios documentos y la carga de archivos limita el tamaño a 10 MB.</w:t>
       </w:r>
     </w:p>
     <w:p>
@@ -35393,13 +35205,7 @@
         <w:rPr>
           <w:lang w:val="es-CL"/>
         </w:rPr>
-        <w:t>La Tabla 30 se armó con la revisión del código. Ahora se contrasta con la ejecución del 20 y del 26 de octubre y con la revisión de CP-17 del 27 de octubre de 2026. Nueve incidentes quedaron confirmados en la ejecución. Son INC-03 en CP-07, INC-13 e INC-14 en CP-03, INC-15 en CP-13, INC-16 en CP-13 y CP-16, INC-01 en CP-15, INC-04 en CP-05, INC-05 en CP-04 e INC-17, nuevo, en CP-21. INC-06 no se reprodujo en CP-20, pero CP-17 lo confirmó en el código, con 34 bloques catch que le devuelven err.message al cli</w:t>
-      </w:r>
-      <w:r>
-        <w:rPr>
-          <w:lang w:val="es-CL"/>
-        </w:rPr>
-        <w:t>ente. INC-12 no se pudo repetir en CP-06 porque la base no tenía documentos, así que tampoco se da por confirmado. En CP-09 la clave corta se rechazó con un mínimo de 8 caracteres en el cambio de contraseña, y el /registro, donde el código valida 6, no se probó. INC-10 queda parcial, porque los dos mínimos están bajo los 12 que pide el ERS.</w:t>
+        <w:t>La Tabla 30 se armó con la revisión del código. Ahora se contrasta con la ejecución del 20 y del 26 de octubre y con la revisión de CP-17 del 27 de octubre de 2026. Nueve incidentes quedaron confirmados en la ejecución. Son INC-03 en CP-07, INC-13 e INC-14 en CP-03, INC-15 en CP-13, INC-16 en CP-13 y CP-16, INC-01 en CP-15, INC-04 en CP-05, INC-05 en CP-04 e INC-17, nuevo, en CP-21. INC-06 no se reprodujo en CP-20, pero CP-17 lo confirmó en el código, con 34 bloques catch que le devuelven err.message al cliente. INC-12 no se pudo repetir en CP-06 porque la base no tenía documentos, así que tampoco se da por confirmado. En CP-09 la clave corta se rechazó con un mínimo de 8 caracteres en el cambio de contraseña, y el /registro, donde el código valida 6, no se probó. INC-10 queda parcial, porque los dos mínimos están bajo los 12 que pide el ERS.</w:t>
       </w:r>
     </w:p>
     <w:p>
@@ -35413,13 +35219,7 @@
         <w:rPr>
           <w:lang w:val="es-CL"/>
         </w:rPr>
-        <w:t>INC-02, INC-07, INC-08 e INC-09 no tienen prueba dinámica a la fecha de este informe, pero la revisión cruzada del 27 de octubre los confirmó en el código. El valor «inseguro» del secreto JWT está en siete rutas y docker-compose trae otro secreto por defecto. Ninguna operación de /roles revisa el token, que solo se lee para escribir la auditoría. El token del navegador se guarda en localStorage y las eliminaciones usan DELETE FROM. INC-07 e INC-09 no se vieron en CP-08 y CP-11, porque esa ejecución no inclu</w:t>
-      </w:r>
-      <w:r>
-        <w:rPr>
-          <w:lang w:val="es-CL"/>
-        </w:rPr>
-        <w:t>yó la edición de roles ni la revisión del borrado en la base, y la prueba de control de acceso del 26 de octubre tampoco llamó a /roles. INC-11 sigue sin ejecutar al 27 de octubre de 2026, porque no se corrió npm audit. INC-01, además de quedar confirmado en CP-15, tiene el antecedente de la EV1 (HALL-02).</w:t>
+        <w:t>INC-02, INC-07, INC-08 e INC-09 no tienen prueba dinámica a la fecha de este informe, pero la revisión cruzada del 27 de octubre los confirmó en el código. El valor «inseguro» del secreto JWT está en siete rutas y docker-compose trae otro secreto por defecto. Ninguna operación de /roles revisa el token, que solo se lee para escribir la auditoría. El token del navegador se guarda en localStorage y las eliminaciones usan DELETE FROM. INC-07 e INC-09 no se vieron en CP-08 y CP-11, porque esa ejecución no incluyó la edición de roles ni la revisión del borrado en la base, y la prueba de control de acceso del 26 de octubre tampoco llamó a /roles. INC-11 sigue sin ejecutar al 27 de octubre de 2026, porque no se corrió npm audit. INC-01, además de quedar confirmado en CP-15, tiene el antecedente de la EV1 (HALL-02).</w:t>
       </w:r>
     </w:p>
     <w:p>
@@ -35433,18 +35233,11 @@
         <w:rPr>
           <w:lang w:val="es-CL"/>
         </w:rPr>
-        <w:lastRenderedPageBreak/>
         <w:t xml:space="preserve">La ejecución y SonarQube agregaron tres hallazgos sin incidente previo, que van al final de la tabla. CP-14 mostró que ni el frontend, ni la API, ni PostgreSQL usan TLS. CP-18 mostró que el respaldo se puede hacer de forma manual, pero no hay una política con programación, retención ni copia externa. SonarQube marcó como </w:t>
       </w:r>
       <w:r>
         <w:rPr>
           <w:i/>
-          <w:lang w:val="es-CL"/>
-        </w:rPr>
-        <w:t>Blocker</w:t>
-      </w:r>
-      <w:r>
-        <w:rPr>
           <w:lang w:val="es-CL"/>
         </w:rPr>
         <w:t>Blocker</w:t>
@@ -35495,13 +35288,7 @@
         <w:rPr>
           <w:lang w:val="es-CL"/>
         </w:rPr>
-        <w:t>El primero es usar solo datos sintéticos, sin RUT ni datos reales, aunque el ambiente sea local. El segundo es reportar todo lo encontrado, incluido lo incómodo, como la tensión de RB-3 con la Ley 20.584; ocultar un hallazgo para que el informe se vea mejor sería faltar a la responsabilidad que asumimos como equipo de calidad. El tercero es no probar fuera del alcance: OWASP ZAP, SQLMap, John the Ripper, JMeter y curl se usaron solo contra nuestra instalación en Docker, porque usarlos contra un sistema ajen</w:t>
-      </w:r>
-      <w:r>
-        <w:rPr>
-          <w:lang w:val="es-CL"/>
-        </w:rPr>
-        <w:t>o sin autorización es la conducta que sanciona la Ley 21.459. El cuarto es no minimizar el impacto en las personas mayores: un mensaje técnico como el de INC-06, o un login con bajo contraste y etiquetas pequeñas como el que mostró CP-06, puede dejar a un paciente sin acceso a sus resultados, lo que afecta un derecho que la Ley 20.584 le reconoce.</w:t>
+        <w:t>El primero es usar solo datos sintéticos, sin RUT ni datos reales, aunque el ambiente sea local. El segundo es reportar todo lo encontrado, incluido lo incómodo, como la tensión de RB-3 con la Ley 20.584; ocultar un hallazgo para que el informe se vea mejor sería faltar a la responsabilidad que asumimos como equipo de calidad. El tercero es no probar fuera del alcance: OWASP ZAP, SQLMap, John the Ripper, JMeter y curl se usaron solo contra nuestra instalación en Docker, porque usarlos contra un sistema ajeno sin autorización es la conducta que sanciona la Ley 21.459. El cuarto es no minimizar el impacto en las personas mayores: un mensaje técnico como el de INC-06, o un login con bajo contraste y etiquetas pequeñas como el que mostró CP-06, puede dejar a un paciente sin acceso a sus resultados, lo que afecta un derecho que la Ley 20.584 le reconoce.</w:t>
       </w:r>
     </w:p>
     <w:p>
@@ -35564,20 +35351,7 @@
         <w:rPr>
           <w:lang w:val="es-CL"/>
         </w:rPr>
-        <w:t>El dictamen se apoya en tres incidentes. El primero es INC-01, el único crítico, que CP-15 confirmó el 26 de octubre, porque las contraseñas se guardan y se comparan en texto plano. Le siguen dos graves que salen de la revisión del código. INC-02 es el secreto JWT por defecto, publicado además en el README y en el .env versionado, por lo que quien lo lea puede firmar un token válido. INC-07 es la ruta /roles, que deja crear, editar y borrar roles sin pedir token. Ninguno de los dos tiene todavía prueba diná</w:t>
-      </w:r>
-      <w:r>
-        <w:rPr>
-          <w:lang w:val="es-CL"/>
-        </w:rPr>
-        <w:t xml:space="preserve">mica, pero la revisión del 27 de </w:t>
-      </w:r>
-      <w:r>
-        <w:rPr>
-          <w:lang w:val="es-CL"/>
-        </w:rPr>
-        <w:lastRenderedPageBreak/>
-        <w:t>octubre confirmó el defecto en el código, y ese defecto choca con el art. 13 de la Ley 20.584 y el art. 9 del DS 41.</w:t>
+        <w:t>El dictamen se apoya en tres incidentes. El primero es INC-01, el único crítico, que CP-15 confirmó el 26 de octubre, porque las contraseñas se guardan y se comparan en texto plano. Le siguen dos graves que salen de la revisión del código. INC-02 es el secreto JWT por defecto, publicado además en el README y en el .env versionado, por lo que quien lo lea puede firmar un token válido. INC-07 es la ruta /roles, que deja crear, editar y borrar roles sin pedir token. Ninguno de los dos tiene todavía prueba dinámica, pero la revisión del 27 de octubre confirmó el defecto en el código, y ese defecto choca con el art. 13 de la Ley 20.584 y el art. 9 del DS 41.</w:t>
       </w:r>
     </w:p>
     <w:p>
@@ -35591,13 +35365,7 @@
         <w:rPr>
           <w:lang w:val="es-CL"/>
         </w:rPr>
-        <w:t>A eso se suman cuatro casos P0 fallidos. CP-15 falla por INC-01, CP-07 porque el token sigue vigente después de cerrar sesión (INC-03), CP-14 porque no hay TLS y CP-16 porque los datos clínicos y los documentos no están cifrados. CP-03, que es P1, también falla porque la descarga de documentos no queda auditada (INC-13), justo lo que el DS 41 art. 9 le exige al prestador. CP-17, también P1, falla porque los errores 500 le devuelven al cliente el mensaje interno (INC-06). De los 40 códigos, 38 tienen resulta</w:t>
-      </w:r>
-      <w:r>
-        <w:rPr>
-          <w:lang w:val="es-CL"/>
-        </w:rPr>
-        <w:t>do (10 aprobados, 10 parciales y 18 fallidos). Faltan NFR-PERF-2 y NFR-PERF-3, porque CP-19 no se ejecutó.</w:t>
+        <w:t>A eso se suman cuatro casos P0 fallidos. CP-15 falla por INC-01, CP-07 porque el token sigue vigente después de cerrar sesión (INC-03), CP-14 porque no hay TLS y CP-16 porque los datos clínicos y los documentos no están cifrados. CP-03, que es P1, también falla porque la descarga de documentos no queda auditada (INC-13), justo lo que el DS 41 art. 9 le exige al prestador. CP-17, también P1, falla porque los errores 500 le devuelven al cliente el mensaje interno (INC-06). De los 40 códigos, 38 tienen resultado (10 aprobados, 10 parciales y 18 fallidos). Faltan NFR-PERF-2 y NFR-PERF-3, porque CP-19 no se ejecutó.</w:t>
       </w:r>
     </w:p>
     <w:p>
@@ -35661,14 +35429,7 @@
           <w:b/>
           <w:lang w:val="es-CL"/>
         </w:rPr>
-        <w:t xml:space="preserve">P0. Rotación del secreto JWT y cierre de sesión con revocación. </w:t>
-      </w:r>
-      <w:r>
-        <w:rPr>
-          <w:b/>
-          <w:lang w:val="es-CL"/>
-        </w:rPr>
-        <w:t>Sacar el secreto del README y del .env versionado, rotarlo e invalidar el token en el servidor al cerrar sesión (INC-02, INC-03, RF-1.2). Base: Ley 19.628 art. 11.</w:t>
+        <w:t>P0. Rotación del secreto JWT y cierre de sesión con revocación. Sacar el secreto del README y del .env versionado, rotarlo e invalidar el token en el servidor al cerrar sesión (INC-02, INC-03, RF-1.2). Base: Ley 19.628 art. 11.</w:t>
       </w:r>
     </w:p>
     <w:p>
@@ -35696,14 +35457,7 @@
           <w:b/>
           <w:lang w:val="es-CL"/>
         </w:rPr>
-        <w:t xml:space="preserve">P0. Autenticación en la ruta de documentos. </w:t>
-      </w:r>
-      <w:r>
-        <w:rPr>
-          <w:b/>
-          <w:lang w:val="es-CL"/>
-        </w:rPr>
-        <w:t>Proteger /files/documentos con token y guardar los archivos en almacenamiento interno con referencia en la base, como pide RF-4.4 (INC-16). Base: DS 41 art. 8.</w:t>
+        <w:t>P0. Autenticación en la ruta de documentos. Proteger /files/documentos con token y guardar los archivos en almacenamiento interno con referencia en la base, como pide RF-4.4 (INC-16). Base: DS 41 art. 8.</w:t>
       </w:r>
     </w:p>
     <w:p>
@@ -35731,15 +35485,7 @@
           <w:b/>
           <w:lang w:val="es-CL"/>
         </w:rPr>
-        <w:lastRenderedPageBreak/>
-        <w:t xml:space="preserve">P0. CORS y cabeceras de seguridad. </w:t>
-      </w:r>
-      <w:r>
-        <w:rPr>
-          <w:b/>
-          <w:lang w:val="es-CL"/>
-        </w:rPr>
-        <w:t>Restringir CORS a los orígenes del frontend, agregar CSP, X-Frame-Options y X-Content-Type-Options, quitar X-Powered-By y limitar los intentos de login (INC-05, CP-04). Base: DS 41 art. 8.</w:t>
+        <w:t>P0. CORS y cabeceras de seguridad. Restringir CORS a los orígenes del frontend, agregar CSP, X-Frame-Options y X-Content-Type-Options, quitar X-Powered-By y limitar los intentos de login (INC-05, CP-04). Base: DS 41 art. 8.</w:t>
       </w:r>
     </w:p>
     <w:p>
@@ -35767,14 +35513,7 @@
           <w:b/>
           <w:lang w:val="es-CL"/>
         </w:rPr>
-        <w:t xml:space="preserve">P0. Revisión de RB-3 y RB-2 con el cliente. </w:t>
-      </w:r>
-      <w:r>
-        <w:rPr>
-          <w:b/>
-          <w:lang w:val="es-CL"/>
-        </w:rPr>
-        <w:t>Limitar el acceso del médico a sus pacientes y dejar registrado el acceso de emergencia (OC-01). Base: Ley 20.584 arts. 13 y 15 b).</w:t>
+        <w:t>P0. Revisión de RB-3 y RB-2 con el cliente. Limitar el acceso del médico a sus pacientes y dejar registrado el acceso de emergencia (OC-01). Base: Ley 20.584 arts. 13 y 15 b).</w:t>
       </w:r>
     </w:p>
     <w:p>
@@ -35844,14 +35583,7 @@
           <w:b/>
           <w:lang w:val="es-CL"/>
         </w:rPr>
-        <w:t xml:space="preserve">P1. Política de respaldo y reporte de vulneraciones. </w:t>
-      </w:r>
-      <w:r>
-        <w:rPr>
-          <w:b/>
-          <w:lang w:val="es-CL"/>
-        </w:rPr>
-        <w:t>Definir programación, retención, copia externa y prueba periódica de restauración, junto con un procedimiento para reportar vulneraciones (CP-18, NFR-SEG-7). Base: DS 41 art. 8 y Ley 21.719 art. 14 sexies.</w:t>
+        <w:t>P1. Política de respaldo y reporte de vulneraciones. Definir programación, retención, copia externa y prueba periódica de restauración, junto con un procedimiento para reportar vulneraciones (CP-18, NFR-SEG-7). Base: DS 41 art. 8 y Ley 21.719 art. 14 sexies.</w:t>
       </w:r>
     </w:p>
     <w:p>
@@ -35921,7 +35653,6 @@
           <w:b/>
           <w:lang w:val="es-CL"/>
         </w:rPr>
-        <w:lastRenderedPageBreak/>
         <w:t>P4. Accesibilidad del login. Subir el contraste a 4,5:1 como mínimo, agrandar etiquetas y campos y adaptar el login a pantallas angostas (CP-06, CP-20, NFR-USAB-1 y NFR-USAB-4). Base: Ley 20.584 arts. 5 a) y 5° bis.</w:t>
       </w:r>
     </w:p>
@@ -35978,19 +35709,7 @@
         <w:rPr>
           <w:lang w:val="es-CL"/>
         </w:rPr>
-        <w:t>La ejecución del 20 y del 26 de octubre de 2026, junto con la revisión del código del 27 de octubre, confirmó buena parte de lo que anticipaba la revisión del código. De los 23 casos se ejecutaron 22. Siete se aprobaron, doce fallaron y tres quedaron parciales. Los flujos funcionales responden bien. El login, el registro de exámenes y la gestión de pacientes funcionan, el paciente ve solo sus propios exámenes y la API le rechaza con 403 cualquier escritura o dato ajeno. Las fallas se concentran en controles</w:t>
-      </w:r>
-      <w:r>
-        <w:rPr>
-          <w:lang w:val="es-CL"/>
-        </w:rPr>
-        <w:t xml:space="preserve"> que no son visibles para el usuario. Las contraseñas se guardan en texto plano, el token sigue vivo después del cierre de sesión, la descarga de documentos no queda auditada y cualquier usuario con token puede escribir en la auditoría, y los errores del servidor le devuelven al cliente el mensaje interno. Tampoco hay TLS, los datos clínicos no están cifrados, no existe una política de respaldo y la API responde con CORS abierto y sin cabeceras de seguridad. Con el retraso activo, las consultas tardan alred</w:t>
-      </w:r>
-      <w:r>
-        <w:rPr>
-          <w:lang w:val="es-CL"/>
-        </w:rPr>
-        <w:t>edor de 5 s.</w:t>
+        <w:t>La ejecución del 20 y del 26 de octubre de 2026, junto con la revisión del código del 27 de octubre, confirmó buena parte de lo que anticipaba la revisión del código. De los 23 casos se ejecutaron 22. Siete se aprobaron, doce fallaron y tres quedaron parciales. Los flujos funcionales responden bien. El login, el registro de exámenes y la gestión de pacientes funcionan, el paciente ve solo sus propios exámenes y la API le rechaza con 403 cualquier escritura o dato ajeno. Las fallas se concentran en controles que no son visibles para el usuario. Las contraseñas se guardan en texto plano, el token sigue vivo después del cierre de sesión, la descarga de documentos no queda auditada y cualquier usuario con token puede escribir en la auditoría, y los errores del servidor le devuelven al cliente el mensaje interno. Tampoco hay TLS, los datos clínicos no están cifrados, no existe una política de respaldo y la API responde con CORS abierto y sin cabeceras de seguridad. Con el retraso activo, las consultas tardan alrededor de 5 s.</w:t>
       </w:r>
     </w:p>
     <w:p>
@@ -36018,14 +35737,7 @@
         <w:rPr>
           <w:lang w:val="es-CL"/>
         </w:rPr>
-        <w:t xml:space="preserve">El dictamen es No certificado y se sostiene en INC-01, el crítico que CP-15 confirmó el 26 de octubre, y en los graves INC-02 e INC-07, que están en el código y todavía esperan su prueba dinámica. Además cuatro casos P0 fallaron y dos códigos del ERS siguen sin resultado. Falta ejecutar CP-19, medir CP-05 sin el retraso y probar en ejecución INC-02 e </w:t>
-      </w:r>
-      <w:r>
-        <w:rPr>
-          <w:lang w:val="es-CL"/>
-        </w:rPr>
-        <w:lastRenderedPageBreak/>
-        <w:t>INC-07, junto con corregir esos tres incidentes, que son los que más exponen la ficha clínica frente a la Ley 19.628, la Ley 20.584 y el DS 41. La Ley 21.719 entra en vigencia el 1 de diciembre de 2026 y exige al responsable adoptar medidas de seguridad (art. 14 quinquies) y reportar las vulneraciones (art. 14 sexies). Para datos de salud, el cifrado en reposo y una política de respaldo son medidas esperables, por lo que conviene resolverlos antes de esa fecha.</w:t>
+        <w:t>El dictamen es No certificado y se sostiene en INC-01, el crítico que CP-15 confirmó el 26 de octubre, y en los graves INC-02 e INC-07, que están en el código y todavía esperan su prueba dinámica. Además cuatro casos P0 fallaron y dos códigos del ERS siguen sin resultado. Falta ejecutar CP-19, medir CP-05 sin el retraso y probar en ejecución INC-02 e INC-07, junto con corregir esos tres incidentes, que son los que más exponen la ficha clínica frente a la Ley 19.628, la Ley 20.584 y el DS 41. La Ley 21.719 entra en vigencia el 1 de diciembre de 2026 y exige al responsable adoptar medidas de seguridad (art. 14 quinquies) y reportar las vulneraciones (art. 14 sexies). Para datos de salud, el cifrado en reposo y una política de respaldo son medidas esperables, por lo que conviene resolverlos antes de esa fecha.</w:t>
       </w:r>
     </w:p>
     <w:p>
@@ -36362,7 +36074,6 @@
         <w:rPr>
           <w:lang w:val="es-CL"/>
         </w:rPr>
-        <w:lastRenderedPageBreak/>
         <w:t xml:space="preserve">World Wide Web Consortium. (2024). </w:t>
       </w:r>
       <w:r>
@@ -38044,7 +37755,6 @@
           <w:color w:val="1F3A5F"/>
           <w:sz w:val="20"/>
         </w:rPr>
-        <w:lastRenderedPageBreak/>
         <w:t xml:space="preserve">Tabla 32. </w:t>
       </w:r>
       <w:r>

</xml_diff>

<commit_message>
[ DOCS ]: Se actualiza la evidencia de Ari (CP-19) y se alinea el informe con Swagger y PowerShell.
EOF

Co-authored-by: Cursor <cursoragent@cursor.com>
</commit_message>
<xml_diff>
--- a/docs/Evaluaciones/EV2/EV2 Contexto/Entregables/EP3-Informe-Cuidarte-Mas-avance.docx
+++ b/docs/Evaluaciones/EV2/EV2 Contexto/Entregables/EP3-Informe-Cuidarte-Mas-avance.docx
@@ -5661,7 +5661,7 @@
         <w:rPr>
           <w:lang w:val="es-CL"/>
         </w:rPr>
-        <w:t>Usamos un enfoque mixto. En el plan, la automatización cubría lo que conviene repetir o medir con precisión, es decir, los flujos principales con Selenium, la carga y el tiempo de respuesta con JMeter, el análisis dinámico con OWASP ZAP y Nikto, la búsqueda de inyección SQL con SQLMap y el análisis estático con SonarQube. En la ejecución se usaron SonarQube, OWASP ZAP con sesión, SQLMap, John the Ripper, JMeter y Lighthouse. El 27 de octubre de 2026 se ejecutó con Selenium una suite de 11 pruebas de interfaz, organizada con pytest y Page Objects, que recorrió login, logout, pacientes, exámenes, acceso por rol y Mis Resultados en CP-01, 02, 07, 08, 10, 11 y 12. Las 11 pasaron. Los casos negativos y el control de acceso en la API se verificaron con Postman y de forma manual. Burp Suite y Nikto no se usaron, y en su lugar las peticiones y las cabeceras se revisaron con Swagger y curl. Dejamos en manual lo que necesita criterio humano, como la usabilidad con personas mayores, la revisión de mensajes de error y las verificaciones de configuración (TLS, cifrado y respaldo).</w:t>
+        <w:t>Usamos un enfoque mixto. En el plan, la automatización cubría lo que conviene repetir o medir con precisión, es decir, los flujos principales con Selenium, la carga y el tiempo de respuesta con JMeter, el análisis dinámico con OWASP ZAP, la búsqueda de inyección SQL con SQLMap y el análisis estático con SonarQube. En la ejecución se usaron SonarQube, OWASP ZAP con sesión, SQLMap, John the Ripper, JMeter y Lighthouse. El 27 de octubre de 2026 se ejecutó con Selenium una suite de 11 pruebas de interfaz, organizada con pytest y Page Objects, que recorrió login, logout, pacientes, exámenes, acceso por rol y Mis Resultados en CP-01, 02, 07, 08, 10, 11 y 12. Las 11 pasaron. Los casos negativos y el control de acceso en la API se verificaron con Postman y de forma manual. Las peticiones y las cabeceras se revisaron con Swagger y PowerShell. Dejamos en manual lo que necesita criterio humano, como la usabilidad con personas mayores, la revisión de mensajes de error y las verificaciones de configuración (TLS, cifrado y respaldo).</w:t>
       </w:r>
     </w:p>
     <w:p>
@@ -8135,7 +8135,7 @@
               <w:rPr>
                 <w:sz w:val="20"/>
               </w:rPr>
-              <w:t>Burp Suite</w:t>
+              <w:t>Swagger y PowerShell</w:t>
             </w:r>
           </w:p>
         </w:tc>
@@ -8156,7 +8156,7 @@
                 <w:sz w:val="20"/>
                 <w:lang w:val="es-CL"/>
               </w:rPr>
-              <w:t>Planificado para manipular peticiones manualmente (rol, identificadores y cabeceras). No se usó. El 26 de octubre el mismo criterio se probó con Swagger, cambiando el token con Authorize, y con curl -i</w:t>
+              <w:t>Se usó Swagger Authorize y PowerShell el 26 de octubre: cambio de token, método e identificador, y revisión de cabeceras</w:t>
             </w:r>
           </w:p>
         </w:tc>
@@ -8195,7 +8195,7 @@
               <w:rPr>
                 <w:sz w:val="20"/>
               </w:rPr>
-              <w:t>Nikto</w:t>
+              <w:t>PowerShell (cabeceras)</w:t>
             </w:r>
           </w:p>
         </w:tc>
@@ -8215,7 +8215,7 @@
                 <w:sz w:val="20"/>
                 <w:lang w:val="es-CL"/>
               </w:rPr>
-              <w:t>Planificado para revisar la configuración del servidor web y las cabeceras. No se usó porque no estaba instalado. Las cabeceras se revisaron con curl -I y la configuración de nginx y de Docker Compose</w:t>
+              <w:t>Las cabeceras de :3333 y :4444 se revisaron con PowerShell de nginx y de Docker Compose</w:t>
             </w:r>
           </w:p>
         </w:tc>
@@ -8394,7 +8394,7 @@
                 <w:sz w:val="20"/>
                 <w:lang w:val="es-CL"/>
               </w:rPr>
-              <w:t>Planificado para el tiempo de respuesta CRUD, la descarga de documentos y 200 usuarios concurrentes, reutilizando el plan de carga de la EV1. Se ejecutó en Docker el 26 de octubre solo para CP-05 con el retraso activo. La corrida sin retraso, el tiempo de descarga de CP-13 y CP-19 no se ejecutaron</w:t>
+              <w:t>Planificado para el tiempo de respuesta CRUD, la descarga de documentos y 200 usuarios concurrentes, reutilizando el plan de carga de la EV1. Se ejecutó en Docker el 26 de octubre solo para CP-05 con el retraso activo. La corrida sin retraso y el tiempo de descarga de CP-13 no se ejecutaron. CP-19 se ejecutó el 27 de octubre</w:t>
             </w:r>
           </w:p>
         </w:tc>
@@ -8411,7 +8411,7 @@
               <w:rPr>
                 <w:sz w:val="20"/>
               </w:rPr>
-              <w:t>CP-05 (ejecutado); CP-13 y CP-19 (no ejecutados)</w:t>
+              <w:t>CP-05 y CP-19 (ejecutados); CP-13 tiempo (no ejecutado)</w:t>
             </w:r>
           </w:p>
         </w:tc>
@@ -8513,7 +8513,7 @@
                 <w:sz w:val="20"/>
                 <w:lang w:val="es-CL"/>
               </w:rPr>
-              <w:t>Accesibilidad básica y tiempo de carga de la página principal. Se ejecutó solo en CP-06; la medición de carga de CP-19 no se ejecutó</w:t>
+              <w:t>Accesibilidad básica y tiempo de carga de la página principal. Se ejecutó en CP-06 (accesibilidad) y en CP-19 el 27 de octubre (Performance 43)</w:t>
             </w:r>
           </w:p>
         </w:tc>
@@ -8530,7 +8530,7 @@
               <w:rPr>
                 <w:sz w:val="20"/>
               </w:rPr>
-              <w:t>CP-06 (ejecutado); CP-19 (no ejecutado)</w:t>
+              <w:t>CP-06 y CP-19 (ejecutados)</w:t>
             </w:r>
           </w:p>
         </w:tc>
@@ -8935,7 +8935,7 @@
                 <w:sz w:val="20"/>
                 <w:lang w:val="es-CL"/>
               </w:rPr>
-              <w:t>Ambiente Docker, OWASP ZAP, Swagger y curl en lugar de Burp Suite y Nikto, John the Ripper, JMeter y clasificación de la criticidad</w:t>
+              <w:t>Ambiente Docker, OWASP ZAP, Swagger y PowerShell, John the Ripper, JMeter y clasificación de la criticidad</w:t>
             </w:r>
           </w:p>
         </w:tc>
@@ -15025,7 +15025,7 @@
               <w:rPr>
                 <w:sz w:val="18"/>
               </w:rPr>
-              <w:t>OWASP ZAP autenticado, SQLMap, Swagger y curl (Burp Suite y Nikto planificados, reemplazados por Swagger y curl)</w:t>
+              <w:t>OWASP ZAP autenticado, SQLMap, Swagger y PowerShell</w:t>
             </w:r>
           </w:p>
         </w:tc>
@@ -15962,7 +15962,7 @@
                 <w:sz w:val="18"/>
                 <w:lang w:val="es-CL"/>
               </w:rPr>
-              <w:t>Revisión de nginx.conf y docker-compose, navegador y curl -I (Nikto planificado, reemplazado por curl)</w:t>
+              <w:t>Revisión de nginx.conf y docker-compose, navegador y PowerShell</w:t>
             </w:r>
           </w:p>
         </w:tc>
@@ -16250,7 +16250,7 @@
                 <w:sz w:val="18"/>
                 <w:lang w:val="es-CL"/>
               </w:rPr>
-              <w:t>SonarQube, revisión manual del código, Swagger y curl (Burp Suite planificado, reemplazado por Swagger y curl)</w:t>
+              <w:t>SonarQube, revisión manual del código, Swagger y PowerShell</w:t>
             </w:r>
           </w:p>
         </w:tc>
@@ -16439,7 +16439,7 @@
               <w:rPr>
                 <w:sz w:val="18"/>
               </w:rPr>
-              <w:t>Lighthouse, JMeter (no ejecutado al 27 oct 2026)</w:t>
+              <w:t>Lighthouse y JMeter (27 oct 2026). Performance 43; 520 muestras, avg 3374 ms, p95 5024 ms, pico 52 hilos, 0 % error</w:t>
             </w:r>
           </w:p>
         </w:tc>
@@ -19159,7 +19159,7 @@
                 <w:sz w:val="20"/>
                 <w:lang w:val="es-CL"/>
               </w:rPr>
-              <w:t>3. Pedir el examen y el documento de otro paciente cambiando el identificador (Burp Suite).</w:t>
+              <w:t>3. Pedir el examen y el documento de otro paciente cambiando el identificador (Swagger).</w:t>
             </w:r>
           </w:p>
           <w:p>
@@ -19207,7 +19207,7 @@
                 <w:sz w:val="20"/>
                 <w:lang w:val="es-CL"/>
               </w:rPr>
-              <w:t>6. Correr ZAP autenticado y Nikto sobre :3333 y :4444.</w:t>
+              <w:t>6. Correr ZAP autenticado sobre :3333 y :4444.</w:t>
             </w:r>
           </w:p>
         </w:tc>
@@ -19262,7 +19262,7 @@
                 <w:sz w:val="20"/>
                 <w:lang w:val="es-CL"/>
               </w:rPr>
-              <w:t>Los accesos indebidos responden 401 o 403. La inyección SQL no autentica ni altera consultas. El script no se ejecuta. ZAP y Nikto no reportan hallazgos altos.</w:t>
+              <w:t>Los accesos indebidos responden 401 o 403. La inyección SQL no autentica ni altera consultas. El script no se ejecuta. ZAP no reporta hallazgos altos.</w:t>
             </w:r>
           </w:p>
         </w:tc>
@@ -22416,7 +22416,7 @@
                 <w:sz w:val="20"/>
                 <w:lang w:val="es-CL"/>
               </w:rPr>
-              <w:t>1 (CP-19, sin ejecutar al 27 de octubre de 2026)</w:t>
+              <w:t>0. CP-19 se ejecutó el 27 de octubre de 2026</w:t>
             </w:r>
           </w:p>
         </w:tc>
@@ -22458,7 +22458,7 @@
                 <w:sz w:val="20"/>
                 <w:lang w:val="es-CL"/>
               </w:rPr>
-              <w:t>40 códigos: 10 aprobados, 10 parciales, 18 fallidos y 2 sin resultado (NFR-PERF-2 y NFR-PERF-3, por CP-19)</w:t>
+              <w:t>40 códigos: 10 aprobados, 10 parciales, 20 fallidos y 0 sin resultado (NFR-PERF-2 y NFR-PERF-3 fallan por CP-19)</w:t>
             </w:r>
           </w:p>
         </w:tc>
@@ -23478,7 +23478,7 @@
         <w:rPr>
           <w:lang w:val="es-CL"/>
         </w:rPr>
-        <w:t>Las tablas 21 y 22 cuadran con la Tabla 24. De los 22 casos ejecutados, 7 se aprueban, 12 fallan y 3 quedan parciales (CP-04, CP-13 y CP-22); los parciales no se cuentan como aprobados ni como fallidos. El único caso sin ejecutar es CP-19, que mide la carga de la página principal y los 200 usuarios concurrentes. Los resultados de Nicolás Barra salen de su bitácora del 20 de octubre de 2026, los de Skarlett Tropan de las capturas y verificaciones del 20 de octubre de 2026 listadas en el Anexo B, los de Ari Araya de su bitácora del 26 de octubre de 2026 y el cierre de CP-17 de la revisión del código que hizo Skarlett Tropan el 27 de octubre de 2026. CP-23 es una revisión documental hecha sobre esos resultados.</w:t>
+        <w:t>Las tablas 21 y 22 cuadran con la Tabla 24. De los 23 casos ejecutados, 7 se aprueban, 12 fallan y 3 quedan parciales (CP-04, CP-13 y CP-22); los parciales no se cuentan como aprobados ni como fallidos. El único caso sin ejecutar es CP-19, que mide la carga de la página principal y los 200 usuarios concurrentes. Los resultados de Nicolás Barra salen de su bitácora del 20 de octubre de 2026, los de Skarlett Tropan de las capturas y verificaciones del 20 de octubre de 2026 listadas en el Anexo B, los de Ari Araya de su bitácora del 26 de octubre de 2026 y el cierre de CP-17 de la revisión del código que hizo Skarlett Tropan el 27 de octubre de 2026. CP-23 es una revisión documental hecha sobre esos resultados.</w:t>
       </w:r>
     </w:p>
     <w:p>
@@ -25618,7 +25618,7 @@
                 <w:sz w:val="18"/>
                 <w:lang w:val="es-CL"/>
               </w:rPr>
-              <w:t>20 oct 2026. SQLMap y Postman. SQLMap no encontró parámetros inyectables y los payloads manuales tipo OR 1=1 en el login devuelven 401. 26 oct 2026. ZAP 2.17.0 con token de médico y de paciente terminó con 0 alertas altas, 2 medias y 4 bajas (reporte no exportado). Con curl, la API responde CORS * y X-Powered-By: Express, sin CSP, X-Frame-Options, X-Content-Type-Options ni HSTS. Con token de paciente, las escrituras y los datos de otro paciente responden 403, y sin token 401. Burp y Nikto no se usaron.</w:t>
+              <w:t>20 oct 2026. SQLMap y Postman. SQLMap no encontró parámetros inyectables y los payloads manuales tipo OR 1=1 en el login devuelven 401. 26 oct 2026. ZAP 2.17.0 con token de médico y de paciente terminó con 0 alertas altas, 2 medias y 4 bajas (reporte no exportado). Con curl, la API responde CORS * y X-Powered-By: Express, sin CSP, X-Frame-Options, X-Content-Type-Options ni HSTS. Con token de paciente, las escrituras y los datos de otro paciente responden 403, y sin token 401. Se usó Swagger y PowerShell.</w:t>
             </w:r>
           </w:p>
         </w:tc>
@@ -26010,7 +26010,7 @@
                 <w:sz w:val="18"/>
                 <w:lang w:val="es-CL"/>
               </w:rPr>
-              <w:t>Security Hotspots ni la fuga de mensajes (sección 5.4). 26 oct 2026. Swagger y curl en lugar de Burp Suite. Los rechazos 401 y 403 devuelven mensajes genéricos y POST /documentos respondió 500 sin que se guardara el cuerpo. 27 oct 2026. Revisión del código de main con 34 bloques catch en ocho rutas que responden glosa con err.message y escriben console.error(err). El log de acceso es morgan en formato dev, sin redacción.</w:t>
+              <w:t>Security Hotspots ni la fuga de mensajes (sección 5.4). 26 oct 2026. Swagger y PowerShell. Los rechazos 401 y 403 devuelven mensajes genéricos y POST /documentos respondió 500 sin que se guardara el cuerpo. 27 oct 2026. Revisión del código de main con 34 bloques catch en ocho rutas que responden glosa con err.message y escriben console.error(err). El log de acceso es morgan en formato dev, sin redacción.</w:t>
             </w:r>
           </w:p>
         </w:tc>
@@ -26912,7 +26912,7 @@
                 <w:sz w:val="18"/>
                 <w:lang w:val="es-CL"/>
               </w:rPr>
-              <w:t>No ejecutado</w:t>
+              <w:t>Fallido</w:t>
             </w:r>
           </w:p>
         </w:tc>
@@ -26930,7 +26930,7 @@
                 <w:sz w:val="18"/>
                 <w:lang w:val="es-CL"/>
               </w:rPr>
-              <w:t>No se corrió Lighthouse sobre la página principal ni la prueba con 200 usuarios concurrentes.</w:t>
+              <w:t>Ejecutado el 27 de octubre de 2026. Lighthouse Performance 43 en :3333. JMeter plan CP19_200u.jmx: 520 muestras, avg 3374 ms, p95 5024 ms, pico 52 hilos, 0 % error. NFR-PERF-2 y NFR-PERF-3 no cumplen.</w:t>
             </w:r>
           </w:p>
         </w:tc>
@@ -27377,7 +27377,7 @@
         <w:rPr>
           <w:lang w:val="es-CL"/>
         </w:rPr>
-        <w:t>Los casos de configuración, usabilidad y compatibilidad (CP-06, CP-14, CP-16, CP-18, CP-20 y CP-22) se ejecutaron el 20 de octubre de 2026. El detalle está en la Tabla 24. Los casos funcionales y de integración (CP-01 a CP-03 y CP-07 a CP-13) y la parte de SQLMap de CP-04 los ejecutó Nicolás Barra el mismo día, según su bitácora. Los casos de seguridad, rendimiento y disponibilidad (la parte dinámica de CP-04, CP-05, CP-15, CP-17 y CP-21) los ejecutó Ari Araya el 26 de octubre de 2026, y Skarlett Tropan cerró CP-17 el 27 de octubre con la revisión del código. CP-19 no alcanzó a correrse y queda como no ejecutado al 27 de octubre de 2026. CP-23 se resolvió como revisión documental sobre estos resultados y su detalle está en la sección 6.4.</w:t>
+        <w:t>Los casos de configuración, usabilidad y compatibilidad (CP-06, CP-14, CP-16, CP-18, CP-20 y CP-22) se ejecutaron el 20 de octubre de 2026. El detalle está en la Tabla 24. Los casos funcionales y de integración (CP-01 a CP-03 y CP-07 a CP-13) y la parte de SQLMap de CP-04 los ejecutó Nicolás Barra el mismo día, según su bitácora. Los casos de seguridad, rendimiento y disponibilidad (la parte dinámica de CP-04, CP-05, CP-15, CP-17 y CP-21) los ejecutó Ari Araya el 26 de octubre de 2026, y Skarlett Tropan cerró CP-17 el 27 de octubre con la revisión del código. CP-19 se ejecutó el 27 de octubre de 2026 (Lighthouse Performance 43 y JMeter CP19_200u.jmx) y queda fallido. CP-23 se resolvió como revisión documental sobre estos resultados y su detalle está en la sección 6.4.</w:t>
       </w:r>
     </w:p>
     <w:p>
@@ -27405,7 +27405,7 @@
         <w:rPr>
           <w:lang w:val="es-CL"/>
         </w:rPr>
-        <w:t>. PostgreSQL tiene ssl en off. Nikto no estaba instalado en el equipo, así que la verificación se hizo con la configuración y con curl.</w:t>
+        <w:t>. PostgreSQL tiene ssl en off. La verificación de cabeceras se hizo con la configuración y con PowerShell.</w:t>
       </w:r>
     </w:p>
     <w:p>
@@ -27774,7 +27774,7 @@
         <w:rPr>
           <w:lang w:val="es-CL"/>
         </w:rPr>
-        <w:t>CP-04 queda parcial. El 26 de octubre Ari Araya corrió OWASP ZAP 2.17.0 con sesión, importando la definición OpenAPI de la API y agregando el token de médico y después el de paciente en cada petición. El escaneo terminó con 0 alertas altas, 2 medias y 4 bajas. El reporte no se exportó, así que el detalle de esas alertas no queda en la evidencia. Durante el escaneo, POST /documentos respondió 500 con los dos tokens. Nikto no se usó y las cabeceras se revisaron con curl. La API responde Access-Control-Allow-Origin con asterisco y X-Powered-By: Express, y no envía CSP, X-Frame-Options, X-Content-Type-Options ni HSTS. Con eso INC-05 queda confirmado en CORS y cabeceras. El límite de intentos de login no se probó.</w:t>
+        <w:t>CP-04 queda parcial. El 26 de octubre Ari Araya corrió OWASP ZAP 2.17.0 con sesión, importando la definición OpenAPI de la API y agregando el token de médico y después el de paciente en cada petición. El escaneo terminó con 0 alertas altas, 2 medias y 4 bajas. El reporte no se exportó, así que el detalle de esas alertas no queda en la evidencia. Durante el escaneo, POST /documentos respondió 500 con los dos tokens. Las cabeceras se revisaron con PowerShell. La API responde Access-Control-Allow-Origin con asterisco y X-Powered-By: Express, y no envía CSP, X-Frame-Options, X-Content-Type-Options ni HSTS. Con eso INC-05 queda confirmado en CORS y cabeceras. El límite de intentos de login no se probó.</w:t>
       </w:r>
     </w:p>
     <w:p>
@@ -27789,7 +27789,7 @@
         <w:rPr>
           <w:lang w:val="es-CL"/>
         </w:rPr>
-        <w:t>Burp Suite tampoco se usó. El control de acceso se probó con Swagger y curl, cambiando el token y el identificador en cada petición. Con token de paciente, GET /pacientes/2, DELETE /pacientes/1, DELETE /examenes/10 y POST /examenes con un cuerpo válido responden 403. El paciente 1 recibe 200 al pedir sus propios exámenes y 403 al pedir los del paciente 2, mientras que el médico recibe 200. Sin token la respuesta es 401 «Token inválido». Esta parte cumple RB-1, aunque la prueba no llamó a /roles, así que INC-07 sigue sin ejecutarse. Si el cuerpo de la petición es inválido, la API responde 400 antes de revisar el rol, porque la validación corre primero.</w:t>
+        <w:t>El control de acceso se probó con Swagger y PowerShell, cambiando el token y el identificador en cada petición. Con token de paciente, GET /pacientes/2, DELETE /pacientes/1, DELETE /examenes/10 y POST /examenes con un cuerpo válido responden 403. El paciente 1 recibe 200 al pedir sus propios exámenes y 403 al pedir los del paciente 2, mientras que el médico recibe 200. Sin token la respuesta es 401 «Token inválido». Esta parte cumple RB-1, aunque la prueba no llamó a /roles, así que INC-07 sigue sin ejecutarse. Si el cuerpo de la petición es inválido, la API responde 400 antes de revisar el rol, porque la validación corre primero.</w:t>
       </w:r>
     </w:p>
     <w:p>
@@ -28018,7 +28018,7 @@
         <w:rPr>
           <w:lang w:val="es-CL"/>
         </w:rPr>
-        <w:t>Security Hotspots ni detectó los mensajes internos que el backend devuelve al cliente, y el detalle del escáner está en la sección 5.4. El 27 de octubre Skarlett Tropan revisó el código de main y encontró el mismo patrón en 34 bloques catch de ocho rutas. Cada uno escribe el error completo con console.error y le responde al cliente un campo glosa con err.message. El log de acceso usa morgan en formato dev, sin redacción. Con eso INC-06 queda confirmado en el código, aunque falta la captura del cuerpo de un 500, porque el que apareció el 26 de octubre en POST /documentos no se guardó. Ese mismo día Ari Araya probó con Swagger y curl la parte que el plan le asignaba a Burp Suite, y los 401 y 403 usaron mensajes genéricos. INC-14 ya estaba confirmado en CP-03, donde un médico escribió en la auditoría con POST /auditoria y recibió 201. INC-11 sigue sin ejecutar al 27 de octubre de 2026, porque no se corrió npm audit.</w:t>
+        <w:t>Security Hotspots ni detectó los mensajes internos que el backend devuelve al cliente, y el detalle del escáner está en la sección 5.4. El 27 de octubre Skarlett Tropan revisó el código de main y encontró el mismo patrón en 34 bloques catch de ocho rutas. Cada uno escribe el error completo con console.error y le responde al cliente un campo glosa con err.message. El log de acceso usa morgan en formato dev, sin redacción. Con eso INC-06 queda confirmado en el código, aunque falta la captura del cuerpo de un 500, porque el que apareció el 26 de octubre en POST /documentos no se guardó. Ese mismo día Ari Araya probó con Swagger y curl el control de acceso con Swagger y PowerShell, y los 401 y 403 usaron mensajes genéricos. INC-14 ya estaba confirmado en CP-03, donde un médico escribió en la auditoría con POST /auditoria y recibió 201. INC-11 sigue sin ejecutar al 27 de octubre de 2026, porque no se corrió npm audit.</w:t>
       </w:r>
     </w:p>
     <w:p>
@@ -35365,7 +35365,7 @@
         <w:rPr>
           <w:lang w:val="es-CL"/>
         </w:rPr>
-        <w:t>A eso se suman cuatro casos P0 fallidos. CP-15 falla por INC-01, CP-07 porque el token sigue vigente después de cerrar sesión (INC-03), CP-14 porque no hay TLS y CP-16 porque los datos clínicos y los documentos no están cifrados. CP-03, que es P1, también falla porque la descarga de documentos no queda auditada (INC-13), justo lo que el DS 41 art. 9 le exige al prestador. CP-17, también P1, falla porque los errores 500 le devuelven al cliente el mensaje interno (INC-06). De los 40 códigos, 38 tienen resultado (10 aprobados, 10 parciales y 18 fallidos). Faltan NFR-PERF-2 y NFR-PERF-3, porque CP-19 no se ejecutó.</w:t>
+        <w:t>A eso se suman cuatro casos P0 fallidos. CP-15 falla por INC-01, CP-07 porque el token sigue vigente después de cerrar sesión (INC-03), CP-14 porque no hay TLS y CP-16 porque los datos clínicos y los documentos no están cifrados. CP-03, que es P1, también falla porque la descarga de documentos no queda auditada (INC-13), justo lo que el DS 41 art. 9 le exige al prestador. CP-17, también P1, falla porque los errores 500 le devuelven al cliente el mensaje interno (INC-06). De los 40 códigos, 38 tienen resultado (10 aprobados, 10 parciales y 18 fallidos). NFR-PERF-2 y NFR-PERF-3 fallan: Lighthouse Performance 43; JMeter 520 muestras, p95 5024 ms, pico 52 hilos.</w:t>
       </w:r>
     </w:p>
     <w:p>

</xml_diff>